<commit_message>
docs: finalized paper structure, embedded all 3D visualizations, added 2024-2025 citations
</commit_message>
<xml_diff>
--- a/Research_Paper.docx
+++ b/Research_Paper.docx
@@ -2,7 +2,7 @@
 <file path=word/document.xml><?xml version="1.0" encoding="utf-8"?>
 <w:document xmlns:w="http://schemas.openxmlformats.org/wordprocessingml/2006/main" xmlns:m="http://schemas.openxmlformats.org/officeDocument/2006/math" xmlns:r="http://schemas.openxmlformats.org/officeDocument/2006/relationships" xmlns:o="urn:schemas-microsoft-com:office:office" xmlns:v="urn:schemas-microsoft-com:vml" xmlns:w10="urn:schemas-microsoft-com:office:word" xmlns:a="http://schemas.openxmlformats.org/drawingml/2006/main" xmlns:pic="http://schemas.openxmlformats.org/drawingml/2006/picture" xmlns:wp="http://schemas.openxmlformats.org/drawingml/2006/wordprocessingDrawing">
   <w:body>
-    <w:bookmarkStart w:id="29" w:name="X5cde93aadb5fef7ac748872293fbaffd5961446"/>
+    <w:bookmarkStart w:id="40" w:name="X5cde93aadb5fef7ac748872293fbaffd5961446"/>
     <w:p>
       <w:pPr>
         <w:pStyle w:val="Heading1"/>
@@ -51,28 +51,6 @@
           <w:iCs/>
         </w:rPr>
         <w:t xml:space="preserve">Material Science Lab</w:t>
-      </w:r>
-    </w:p>
-    <w:p>
-      <w:pPr>
-        <w:pStyle w:val="BodyText"/>
-      </w:pPr>
-      <w:r>
-        <w:rPr>
-          <w:b/>
-          <w:bCs/>
-        </w:rPr>
-        <w:t xml:space="preserve">Abstract:</w:t>
-      </w:r>
-      <w:r>
-        <w:br/>
-      </w:r>
-      <w:r>
-        <w:rPr>
-          <w:i/>
-          <w:iCs/>
-        </w:rPr>
-        <w:t xml:space="preserve">Sustainable bioplastics such as Polylactic Acid (PLA) and Thermoplastic Starch (TPS) are critical to reducing global plastic waste. However, their physical and chemical behaviors under diverse supply chain environments remain difficult to predict without expensive, time-consuming laboratory weathering. This paper presents a novel deterministic multi-physics simulator that models the kinetic degradation, moisture sorption, and macroscopic structural collapse of biodegradable packaging. By coupling Arrhenius kinetics and Fickian spatial diffusion directly into Classical Lamination Theory (CLT), we bridge the gap between microscopic chemistry and macroscopic mechanical failure. The simulator relies strictly on interpretable physics rather than opaque machine learning architectures, enabling rapid Monte Carlo analysis of supply chain stochasticity. Results demonstrate that variance in supply chain temperature heavily drives variance in failure time, emphasizing the need for kinetic modeling in sustainable packaging design.</w:t>
       </w:r>
     </w:p>
     <w:p>
@@ -82,13 +60,31 @@
         </w:pict>
       </w:r>
     </w:p>
-    <w:bookmarkStart w:id="9" w:name="introduction"/>
+    <w:bookmarkStart w:id="9" w:name="abstract"/>
     <w:p>
       <w:pPr>
         <w:pStyle w:val="Heading2"/>
       </w:pPr>
       <w:r>
-        <w:t xml:space="preserve">1. Introduction</w:t>
+        <w:t xml:space="preserve">Abstract</w:t>
+      </w:r>
+    </w:p>
+    <w:p>
+      <w:pPr>
+        <w:pStyle w:val="FirstParagraph"/>
+      </w:pPr>
+      <w:r>
+        <w:t xml:space="preserve">Sustainable bioplastics such as Polylactic Acid (PLA) and Thermoplastic Starch (TPS) are critical to reducing global plastic waste. However, their physical and chemical behaviors under diverse supply chain environments remain difficult to predict without expensive, time-consuming laboratory weathering. This paper presents a novel deterministic multi-physics simulator that models the kinetic degradation, moisture sorption, and macroscopic structural collapse of biodegradable packaging. By coupling Arrhenius kinetics and Fickian spatial diffusion directly into Classical Lamination Theory (CLT), we bridge the gap between microscopic chemistry and macroscopic mechanical failure. The simulator relies strictly on interpretable physics rather than opaque machine learning architectures, enabling rapid Monte Carlo analysis of supply chain stochasticity. Results demonstrate that variance in supply chain temperature heavily drives variance in failure time, emphasizing the need for kinetic modeling in sustainable packaging design.</w:t>
+      </w:r>
+    </w:p>
+    <w:bookmarkEnd w:id="9"/>
+    <w:bookmarkStart w:id="10" w:name="introduction"/>
+    <w:p>
+      <w:pPr>
+        <w:pStyle w:val="Heading2"/>
+      </w:pPr>
+      <w:r>
+        <w:t xml:space="preserve">Introduction</w:t>
       </w:r>
     </w:p>
     <w:p>
@@ -153,21 +149,109 @@
         <w:t xml:space="preserve">of the material [5]. A 3D Forward-Time Central-Space (FTCS) finite difference scheme visualizes moisture pooling, and Monte Carlo sampling evaluates the component’s survivability under diverse climates.</w:t>
       </w:r>
     </w:p>
-    <w:p>
-      <w:r>
-        <w:pict>
-          <v:rect style="width:0;height:1.5pt" o:hralign="center" o:hrstd="t" o:hr="t"/>
-        </w:pict>
-      </w:r>
-    </w:p>
-    <w:bookmarkEnd w:id="9"/>
-    <w:bookmarkStart w:id="13" w:name="methodology"/>
+    <w:bookmarkEnd w:id="10"/>
+    <w:bookmarkStart w:id="11" w:name="related-work"/>
     <w:p>
       <w:pPr>
         <w:pStyle w:val="Heading2"/>
       </w:pPr>
       <w:r>
-        <w:t xml:space="preserve">2. Methodology</w:t>
+        <w:t xml:space="preserve">Related Work</w:t>
+      </w:r>
+    </w:p>
+    <w:p>
+      <w:pPr>
+        <w:pStyle w:val="Compact"/>
+        <w:numPr>
+          <w:ilvl w:val="0"/>
+          <w:numId w:val="1001"/>
+        </w:numPr>
+      </w:pPr>
+      <w:r>
+        <w:rPr>
+          <w:b/>
+          <w:bCs/>
+        </w:rPr>
+        <w:t xml:space="preserve">Kinetic Degradation Models</w:t>
+      </w:r>
+      <w:r>
+        <w:t xml:space="preserve">: Foundational work on Arrhenius kinetics for hydrolytic and thermal decay.</w:t>
+      </w:r>
+    </w:p>
+    <w:p>
+      <w:pPr>
+        <w:pStyle w:val="Compact"/>
+        <w:numPr>
+          <w:ilvl w:val="0"/>
+          <w:numId w:val="1001"/>
+        </w:numPr>
+      </w:pPr>
+      <w:r>
+        <w:rPr>
+          <w:b/>
+          <w:bCs/>
+        </w:rPr>
+        <w:t xml:space="preserve">Moisture Sorption</w:t>
+      </w:r>
+      <w:r>
+        <w:t xml:space="preserve">: Guggenheim-Anderson-de Boer (GAB) isotherm modeling for equilibrium moisture content in biopolymers.</w:t>
+      </w:r>
+    </w:p>
+    <w:p>
+      <w:pPr>
+        <w:pStyle w:val="Compact"/>
+        <w:numPr>
+          <w:ilvl w:val="0"/>
+          <w:numId w:val="1001"/>
+        </w:numPr>
+      </w:pPr>
+      <w:r>
+        <w:rPr>
+          <w:b/>
+          <w:bCs/>
+        </w:rPr>
+        <w:t xml:space="preserve">Composite Mechanics</w:t>
+      </w:r>
+      <w:r>
+        <w:t xml:space="preserve">: Classical Lamination Theory (CLT) (Jones, R.M., 1999) applied to time-dependent degradation of laminates.</w:t>
+      </w:r>
+    </w:p>
+    <w:p>
+      <w:pPr>
+        <w:pStyle w:val="Compact"/>
+        <w:numPr>
+          <w:ilvl w:val="0"/>
+          <w:numId w:val="1001"/>
+        </w:numPr>
+      </w:pPr>
+      <w:r>
+        <w:rPr>
+          <w:b/>
+          <w:bCs/>
+        </w:rPr>
+        <w:t xml:space="preserve">Sensitivity Analysis</w:t>
+      </w:r>
+      <w:r>
+        <w:t xml:space="preserve">: Variance-based global sensitivity analysis using Saltelli sampling and Sobol indices (Saltelli, A. et al., 2010).</w:t>
+      </w:r>
+    </w:p>
+    <w:bookmarkEnd w:id="11"/>
+    <w:bookmarkStart w:id="17" w:name="proposed-system"/>
+    <w:p>
+      <w:pPr>
+        <w:pStyle w:val="Heading2"/>
+      </w:pPr>
+      <w:r>
+        <w:t xml:space="preserve">Proposed System</w:t>
+      </w:r>
+    </w:p>
+    <w:bookmarkStart w:id="15" w:name="system-concept"/>
+    <w:p>
+      <w:pPr>
+        <w:pStyle w:val="Heading3"/>
+      </w:pPr>
+      <w:r>
+        <w:t xml:space="preserve">System concept</w:t>
       </w:r>
     </w:p>
     <w:p>
@@ -175,16 +259,84 @@
         <w:pStyle w:val="FirstParagraph"/>
       </w:pPr>
       <w:r>
-        <w:t xml:space="preserve">The simulator architecture is divided into three coupled regimes: Chemical Degradation, Spatial Moisture Diffusion, and Structural Mechanics.</w:t>
-      </w:r>
-    </w:p>
-    <w:bookmarkStart w:id="10" w:name="thermal-and-uv-kinetics-arrhenius"/>
+        <w:t xml:space="preserve">The simulator models the degradation of packaging trays over a user-specified time horizon. It samples environmental profiles (Temperature, Relative Humidity) via Monte Carlo methods to simulate diverse climate scenarios (e.g., Tropical, Cold Chain). The kinetic modules compute molecular weight decay and moisture uptake over time, which are then mapped to macroscopic structural knockdown factors to predict mechanical failure against user-defined stiffness and strength thresholds.</w:t>
+      </w:r>
+    </w:p>
+    <w:p>
+      <w:pPr>
+        <w:pStyle w:val="BodyText"/>
+      </w:pPr>
+      <w:r>
+        <w:rPr>
+          <w:b/>
+          <w:bCs/>
+        </w:rPr>
+        <w:t xml:space="preserve">Figure 1: The Simulator Dashboard Interface</w:t>
+      </w:r>
+      <w:r>
+        <w:br/>
+      </w:r>
+      <w:r>
+        <w:rPr>
+          <w:i/>
+          <w:iCs/>
+        </w:rPr>
+        <w:t xml:space="preserve">(Dashboard Overview showing material selection and parameter tuning)</w:t>
+      </w:r>
+      <w:r>
+        <w:br/>
+      </w:r>
+      <w:r>
+        <w:drawing>
+          <wp:inline>
+            <wp:extent cx="5334000" cy="3810000"/>
+            <wp:effectExtent b="0" l="0" r="0" t="0"/>
+            <wp:docPr descr="Simulator Dashboard" title="" id="13" name="Picture"/>
+            <a:graphic>
+              <a:graphicData uri="http://schemas.openxmlformats.org/drawingml/2006/picture">
+                <pic:pic>
+                  <pic:nvPicPr>
+                    <pic:cNvPr descr="./dashboard_main.png" id="14" name="Picture"/>
+                    <pic:cNvPicPr>
+                      <a:picLocks noChangeArrowheads="1" noChangeAspect="1"/>
+                    </pic:cNvPicPr>
+                  </pic:nvPicPr>
+                  <pic:blipFill>
+                    <a:blip r:embed="rId12"/>
+                    <a:stretch>
+                      <a:fillRect/>
+                    </a:stretch>
+                  </pic:blipFill>
+                  <pic:spPr bwMode="auto">
+                    <a:xfrm>
+                      <a:off x="0" y="0"/>
+                      <a:ext cx="5334000" cy="3810000"/>
+                    </a:xfrm>
+                    <a:prstGeom prst="rect">
+                      <a:avLst/>
+                    </a:prstGeom>
+                    <a:noFill/>
+                    <a:ln w="9525">
+                      <a:noFill/>
+                      <a:headEnd/>
+                      <a:tailEnd/>
+                    </a:ln>
+                  </pic:spPr>
+                </pic:pic>
+              </a:graphicData>
+            </a:graphic>
+          </wp:inline>
+        </w:drawing>
+      </w:r>
+    </w:p>
+    <w:bookmarkEnd w:id="15"/>
+    <w:bookmarkStart w:id="16" w:name="tech-stack"/>
     <w:p>
       <w:pPr>
         <w:pStyle w:val="Heading3"/>
       </w:pPr>
       <w:r>
-        <w:t xml:space="preserve">2.1 Thermal and UV Kinetics (Arrhenius)</w:t>
+        <w:t xml:space="preserve">Tech stack</w:t>
       </w:r>
     </w:p>
     <w:p>
@@ -192,7 +344,305 @@
         <w:pStyle w:val="FirstParagraph"/>
       </w:pPr>
       <w:r>
-        <w:t xml:space="preserve">We model the decay of the polymer’s molecular weight (</w:t>
+        <w:t xml:space="preserve">To guarantee both high-performance numerical simulation and interactive user accessibility, the software architecture utilizes a modern, open-source Python stack:</w:t>
+      </w:r>
+      <w:r>
+        <w:t xml:space="preserve"> </w:t>
+      </w:r>
+      <w:r>
+        <w:t xml:space="preserve">-</w:t>
+      </w:r>
+      <w:r>
+        <w:t xml:space="preserve"> </w:t>
+      </w:r>
+      <w:r>
+        <w:rPr>
+          <w:b/>
+          <w:bCs/>
+        </w:rPr>
+        <w:t xml:space="preserve">Core Physics Engine (</w:t>
+      </w:r>
+      <w:r>
+        <w:rPr>
+          <w:rStyle w:val="VerbatimChar"/>
+          <w:b/>
+          <w:bCs/>
+        </w:rPr>
+        <w:t xml:space="preserve">NumPy</w:t>
+      </w:r>
+      <w:r>
+        <w:rPr>
+          <w:b/>
+          <w:bCs/>
+        </w:rPr>
+        <w:t xml:space="preserve">)</w:t>
+      </w:r>
+      <w:r>
+        <w:t xml:space="preserve">: The computationally expensive Partial Differential Equations (e.g., the 3D FTCS Fickian solver) and tensor algebra (Classical Lamination Theory matrices) are driven entirely by</w:t>
+      </w:r>
+      <w:r>
+        <w:t xml:space="preserve"> </w:t>
+      </w:r>
+      <w:r>
+        <w:rPr>
+          <w:rStyle w:val="VerbatimChar"/>
+        </w:rPr>
+        <w:t xml:space="preserve">NumPy</w:t>
+      </w:r>
+      <w:r>
+        <w:t xml:space="preserve">. This ensures the mathematical logic is aggressively vectorized and highly portable across hardware environments without requiring complex GPU toolchains.</w:t>
+      </w:r>
+      <w:r>
+        <w:t xml:space="preserve"> </w:t>
+      </w:r>
+      <w:r>
+        <w:t xml:space="preserve">-</w:t>
+      </w:r>
+      <w:r>
+        <w:t xml:space="preserve"> </w:t>
+      </w:r>
+      <w:r>
+        <w:rPr>
+          <w:b/>
+          <w:bCs/>
+        </w:rPr>
+        <w:t xml:space="preserve">Global Sensitivity Analysis (</w:t>
+      </w:r>
+      <w:r>
+        <w:rPr>
+          <w:rStyle w:val="VerbatimChar"/>
+          <w:b/>
+          <w:bCs/>
+        </w:rPr>
+        <w:t xml:space="preserve">SALib</w:t>
+      </w:r>
+      <w:r>
+        <w:rPr>
+          <w:b/>
+          <w:bCs/>
+        </w:rPr>
+        <w:t xml:space="preserve">)</w:t>
+      </w:r>
+      <w:r>
+        <w:t xml:space="preserve">: To conduct rigorous parameter influence testing, the Sensitivity Analysis Library (</w:t>
+      </w:r>
+      <w:r>
+        <w:rPr>
+          <w:rStyle w:val="VerbatimChar"/>
+        </w:rPr>
+        <w:t xml:space="preserve">SALib</w:t>
+      </w:r>
+      <w:r>
+        <w:t xml:space="preserve">) is utilized to generate Monte Carlo Saltelli samples and compute first-order and total-order Sobol sensitivity indices.</w:t>
+      </w:r>
+      <w:r>
+        <w:t xml:space="preserve"> </w:t>
+      </w:r>
+      <w:r>
+        <w:t xml:space="preserve">-</w:t>
+      </w:r>
+      <w:r>
+        <w:t xml:space="preserve"> </w:t>
+      </w:r>
+      <w:r>
+        <w:rPr>
+          <w:b/>
+          <w:bCs/>
+        </w:rPr>
+        <w:t xml:space="preserve">Interactive Interface (</w:t>
+      </w:r>
+      <w:r>
+        <w:rPr>
+          <w:rStyle w:val="VerbatimChar"/>
+          <w:b/>
+          <w:bCs/>
+        </w:rPr>
+        <w:t xml:space="preserve">Streamlit</w:t>
+      </w:r>
+      <w:r>
+        <w:rPr>
+          <w:b/>
+          <w:bCs/>
+        </w:rPr>
+        <w:t xml:space="preserve">)</w:t>
+      </w:r>
+      <w:r>
+        <w:t xml:space="preserve">: Rather than providing a rigid command-line tool, the framework is wrapped in</w:t>
+      </w:r>
+      <w:r>
+        <w:t xml:space="preserve"> </w:t>
+      </w:r>
+      <w:r>
+        <w:rPr>
+          <w:rStyle w:val="VerbatimChar"/>
+        </w:rPr>
+        <w:t xml:space="preserve">Streamlit</w:t>
+      </w:r>
+      <w:r>
+        <w:t xml:space="preserve">, enabling rapid hyperparameter tuning (e.g., Target Lifetimes, Climate baselines) and deterministic comparative studies via a reactive web dashboard.</w:t>
+      </w:r>
+      <w:r>
+        <w:t xml:space="preserve"> </w:t>
+      </w:r>
+      <w:r>
+        <w:t xml:space="preserve">-</w:t>
+      </w:r>
+      <w:r>
+        <w:t xml:space="preserve"> </w:t>
+      </w:r>
+      <w:r>
+        <w:rPr>
+          <w:b/>
+          <w:bCs/>
+        </w:rPr>
+        <w:t xml:space="preserve">Data Visualization (</w:t>
+      </w:r>
+      <w:r>
+        <w:rPr>
+          <w:rStyle w:val="VerbatimChar"/>
+          <w:b/>
+          <w:bCs/>
+        </w:rPr>
+        <w:t xml:space="preserve">Plotly</w:t>
+      </w:r>
+      <w:r>
+        <w:rPr>
+          <w:b/>
+          <w:bCs/>
+        </w:rPr>
+        <w:t xml:space="preserve">)</w:t>
+      </w:r>
+      <w:r>
+        <w:t xml:space="preserve">: 3D geometric sagging meshes, volumetric moisture diffusion gradients, and 1D confidence-band degradation trajectories are dynamically rendered using</w:t>
+      </w:r>
+      <w:r>
+        <w:t xml:space="preserve"> </w:t>
+      </w:r>
+      <w:r>
+        <w:rPr>
+          <w:rStyle w:val="VerbatimChar"/>
+        </w:rPr>
+        <w:t xml:space="preserve">Plotly</w:t>
+      </w:r>
+      <w:r>
+        <w:t xml:space="preserve">’s interactive graphing suite.</w:t>
+      </w:r>
+      <w:r>
+        <w:t xml:space="preserve"> </w:t>
+      </w:r>
+      <w:r>
+        <w:t xml:space="preserve">-</w:t>
+      </w:r>
+      <w:r>
+        <w:t xml:space="preserve"> </w:t>
+      </w:r>
+      <w:r>
+        <w:rPr>
+          <w:b/>
+          <w:bCs/>
+        </w:rPr>
+        <w:t xml:space="preserve">Database Management (</w:t>
+      </w:r>
+      <w:r>
+        <w:rPr>
+          <w:rStyle w:val="VerbatimChar"/>
+          <w:b/>
+          <w:bCs/>
+        </w:rPr>
+        <w:t xml:space="preserve">PyYAML</w:t>
+      </w:r>
+      <w:r>
+        <w:rPr>
+          <w:b/>
+          <w:bCs/>
+        </w:rPr>
+        <w:t xml:space="preserve">)</w:t>
+      </w:r>
+      <w:r>
+        <w:t xml:space="preserve">: Material properties and kinetic constants (Activation Energy, Monolayer Moisture, etc.) are strictly separated from the codebase using</w:t>
+      </w:r>
+      <w:r>
+        <w:t xml:space="preserve"> </w:t>
+      </w:r>
+      <w:r>
+        <w:rPr>
+          <w:rStyle w:val="VerbatimChar"/>
+        </w:rPr>
+        <w:t xml:space="preserve">PyYAML</w:t>
+      </w:r>
+      <w:r>
+        <w:t xml:space="preserve">.</w:t>
+      </w:r>
+    </w:p>
+    <w:bookmarkEnd w:id="16"/>
+    <w:bookmarkEnd w:id="17"/>
+    <w:bookmarkStart w:id="22" w:name="methodology"/>
+    <w:p>
+      <w:pPr>
+        <w:pStyle w:val="Heading2"/>
+      </w:pPr>
+      <w:r>
+        <w:t xml:space="preserve">Methodology</w:t>
+      </w:r>
+    </w:p>
+    <w:p>
+      <w:pPr>
+        <w:pStyle w:val="FirstParagraph"/>
+      </w:pPr>
+      <w:r>
+        <w:t xml:space="preserve">The simulation engine relies on the following core physical models, evaluated over a discrete time array (e.g.,</w:t>
+      </w:r>
+      <w:r>
+        <w:t xml:space="preserve"> </w:t>
+      </w:r>
+      <m:oMath>
+        <m:r>
+          <m:t>d</m:t>
+        </m:r>
+        <m:r>
+          <m:t>t</m:t>
+        </m:r>
+        <m:r>
+          <m:rPr>
+            <m:sty m:val="p"/>
+          </m:rPr>
+          <m:t>=</m:t>
+        </m:r>
+        <m:r>
+          <m:t>1</m:t>
+        </m:r>
+      </m:oMath>
+      <w:r>
+        <w:t xml:space="preserve"> </w:t>
+      </w:r>
+      <w:r>
+        <w:t xml:space="preserve">day).</w:t>
+      </w:r>
+    </w:p>
+    <w:bookmarkStart w:id="21" w:name="formulas-and-simulation"/>
+    <w:p>
+      <w:pPr>
+        <w:pStyle w:val="Heading3"/>
+      </w:pPr>
+      <w:r>
+        <w:t xml:space="preserve">Formulas and simulation</w:t>
+      </w:r>
+    </w:p>
+    <w:bookmarkStart w:id="18" w:name="Xcad03bd473de3f32277815a890cbdc3d7e4fccc"/>
+    <w:p>
+      <w:pPr>
+        <w:pStyle w:val="Heading4"/>
+      </w:pPr>
+      <w:r>
+        <w:t xml:space="preserve">Thermal &amp; UV Degradation (Arrhenius Kinetics)</w:t>
+      </w:r>
+    </w:p>
+    <w:p>
+      <w:pPr>
+        <w:pStyle w:val="FirstParagraph"/>
+      </w:pPr>
+      <w:r>
+        <w:t xml:space="preserve">Chain scission and molecular weight (</w:t>
       </w:r>
       <m:oMath>
         <m:sSub>
@@ -209,42 +659,36 @@
         </m:sSub>
       </m:oMath>
       <w:r>
-        <w:t xml:space="preserve">) as a first-order kinetic process driven by temperature and ultraviolet (UV) irradiance. The combined reaction rate constant</w:t>
+        <w:t xml:space="preserve">) loss are modeled using the Arrhenius equation. The base rate constant</w:t>
       </w:r>
       <w:r>
         <w:t xml:space="preserve"> </w:t>
       </w:r>
       <m:oMath>
-        <m:sSub>
-          <m:e>
-            <m:r>
-              <m:t>k</m:t>
-            </m:r>
-          </m:e>
-          <m:sub>
-            <m:r>
-              <m:t>t</m:t>
-            </m:r>
-            <m:r>
-              <m:t>o</m:t>
-            </m:r>
-            <m:r>
-              <m:t>t</m:t>
-            </m:r>
-            <m:r>
-              <m:t>a</m:t>
-            </m:r>
-            <m:r>
-              <m:t>l</m:t>
-            </m:r>
-          </m:sub>
-        </m:sSub>
+        <m:r>
+          <m:t>k</m:t>
+        </m:r>
+        <m:r>
+          <m:rPr>
+            <m:sty m:val="p"/>
+          </m:rPr>
+          <m:t>(</m:t>
+        </m:r>
+        <m:r>
+          <m:t>T</m:t>
+        </m:r>
+        <m:r>
+          <m:rPr>
+            <m:sty m:val="p"/>
+          </m:rPr>
+          <m:t>)</m:t>
+        </m:r>
       </m:oMath>
       <w:r>
         <w:t xml:space="preserve"> </w:t>
       </w:r>
       <w:r>
-        <w:t xml:space="preserve">is defined as:</w:t>
+        <w:t xml:space="preserve">is:</w:t>
       </w:r>
     </w:p>
     <w:p>
@@ -256,30 +700,9 @@
           <m:jc m:val="center"/>
         </m:oMathParaPr>
         <m:oMath>
-          <m:sSub>
-            <m:e>
-              <m:r>
-                <m:t>k</m:t>
-              </m:r>
-            </m:e>
-            <m:sub>
-              <m:r>
-                <m:t>t</m:t>
-              </m:r>
-              <m:r>
-                <m:t>o</m:t>
-              </m:r>
-              <m:r>
-                <m:t>t</m:t>
-              </m:r>
-              <m:r>
-                <m:t>a</m:t>
-              </m:r>
-              <m:r>
-                <m:t>l</m:t>
-              </m:r>
-            </m:sub>
-          </m:sSub>
+          <m:r>
+            <m:t>k</m:t>
+          </m:r>
           <m:r>
             <m:rPr>
               <m:sty m:val="p"/>
@@ -288,15 +711,6 @@
           </m:r>
           <m:r>
             <m:t>T</m:t>
-          </m:r>
-          <m:r>
-            <m:rPr>
-              <m:sty m:val="p"/>
-            </m:rPr>
-            <m:t>,</m:t>
-          </m:r>
-          <m:r>
-            <m:t>I</m:t>
           </m:r>
           <m:r>
             <m:rPr>
@@ -362,17 +776,175 @@
                     <m:t>R</m:t>
                   </m:r>
                   <m:r>
+                    <m:rPr>
+                      <m:sty m:val="p"/>
+                    </m:rPr>
+                    <m:t>⋅</m:t>
+                  </m:r>
+                  <m:r>
                     <m:t>T</m:t>
                   </m:r>
                 </m:den>
               </m:f>
             </m:e>
           </m:d>
+        </m:oMath>
+      </m:oMathPara>
+    </w:p>
+    <w:p>
+      <w:pPr>
+        <w:pStyle w:val="FirstParagraph"/>
+      </w:pPr>
+      <w:r>
+        <w:t xml:space="preserve">Where:</w:t>
+      </w:r>
+      <w:r>
+        <w:t xml:space="preserve"> </w:t>
+      </w:r>
+      <w:r>
+        <w:t xml:space="preserve">-</w:t>
+      </w:r>
+      <w:r>
+        <w:t xml:space="preserve"> </w:t>
+      </w:r>
+      <m:oMath>
+        <m:r>
+          <m:t>A</m:t>
+        </m:r>
+      </m:oMath>
+      <w:r>
+        <w:t xml:space="preserve">: Pre-exponential frequency factor</w:t>
+      </w:r>
+      <w:r>
+        <w:t xml:space="preserve"> </w:t>
+      </w:r>
+      <w:r>
+        <w:t xml:space="preserve">-</w:t>
+      </w:r>
+      <w:r>
+        <w:t xml:space="preserve"> </w:t>
+      </w:r>
+      <m:oMath>
+        <m:sSub>
+          <m:e>
+            <m:r>
+              <m:t>E</m:t>
+            </m:r>
+          </m:e>
+          <m:sub>
+            <m:r>
+              <m:t>a</m:t>
+            </m:r>
+          </m:sub>
+        </m:sSub>
+      </m:oMath>
+      <w:r>
+        <w:t xml:space="preserve">: Activation energy (J/mol)</w:t>
+      </w:r>
+      <w:r>
+        <w:t xml:space="preserve"> </w:t>
+      </w:r>
+      <w:r>
+        <w:t xml:space="preserve">-</w:t>
+      </w:r>
+      <w:r>
+        <w:t xml:space="preserve"> </w:t>
+      </w:r>
+      <m:oMath>
+        <m:r>
+          <m:t>R</m:t>
+        </m:r>
+      </m:oMath>
+      <w:r>
+        <w:t xml:space="preserve">: Universal gas constant (8.314 J/(mol·K))</w:t>
+      </w:r>
+      <w:r>
+        <w:t xml:space="preserve"> </w:t>
+      </w:r>
+      <w:r>
+        <w:t xml:space="preserve">-</w:t>
+      </w:r>
+      <w:r>
+        <w:t xml:space="preserve"> </w:t>
+      </w:r>
+      <m:oMath>
+        <m:r>
+          <m:t>T</m:t>
+        </m:r>
+      </m:oMath>
+      <w:r>
+        <w:t xml:space="preserve">: Absolute temperature (K)</w:t>
+      </w:r>
+    </w:p>
+    <w:p>
+      <w:pPr>
+        <w:pStyle w:val="BodyText"/>
+      </w:pPr>
+      <w:r>
+        <w:t xml:space="preserve">UV-induced degradation is coupled with temperature and irradiance (</w:t>
+      </w:r>
+      <m:oMath>
+        <m:r>
+          <m:t>I</m:t>
+        </m:r>
+      </m:oMath>
+      <w:r>
+        <w:t xml:space="preserve">):</w:t>
+      </w:r>
+    </w:p>
+    <w:p>
+      <w:pPr>
+        <w:pStyle w:val="BodyText"/>
+      </w:pPr>
+      <m:oMathPara>
+        <m:oMathParaPr>
+          <m:jc m:val="center"/>
+        </m:oMathParaPr>
+        <m:oMath>
+          <m:sSub>
+            <m:e>
+              <m:r>
+                <m:t>k</m:t>
+              </m:r>
+            </m:e>
+            <m:sub>
+              <m:r>
+                <m:t>u</m:t>
+              </m:r>
+              <m:r>
+                <m:t>v</m:t>
+              </m:r>
+            </m:sub>
+          </m:sSub>
           <m:r>
             <m:rPr>
               <m:sty m:val="p"/>
             </m:rPr>
-            <m:t>+</m:t>
+            <m:t>(</m:t>
+          </m:r>
+          <m:r>
+            <m:t>T</m:t>
+          </m:r>
+          <m:r>
+            <m:rPr>
+              <m:sty m:val="p"/>
+            </m:rPr>
+            <m:t>,</m:t>
+          </m:r>
+          <m:r>
+            <m:t>I</m:t>
+          </m:r>
+          <m:r>
+            <m:rPr>
+              <m:sty m:val="p"/>
+            </m:rPr>
+            <m:t>)</m:t>
+          </m:r>
+          <m:r>
+            <m:rPr>
+              <m:sty m:val="p"/>
+            </m:rPr>
+            <m:t>=</m:t>
           </m:r>
           <m:sSub>
             <m:e>
@@ -477,6 +1049,12 @@
                     <m:t>R</m:t>
                   </m:r>
                   <m:r>
+                    <m:rPr>
+                      <m:sty m:val="p"/>
+                    </m:rPr>
+                    <m:t>⋅</m:t>
+                  </m:r>
+                  <m:r>
                     <m:t>T</m:t>
                   </m:r>
                 </m:den>
@@ -491,206 +1069,159 @@
         <w:pStyle w:val="FirstParagraph"/>
       </w:pPr>
       <w:r>
-        <w:t xml:space="preserve">where</w:t>
-      </w:r>
-      <w:r>
-        <w:t xml:space="preserve"> </w:t>
-      </w:r>
-      <m:oMath>
-        <m:sSub>
-          <m:e>
-            <m:r>
-              <m:t>E</m:t>
-            </m:r>
-          </m:e>
-          <m:sub>
-            <m:r>
-              <m:t>a</m:t>
-            </m:r>
-          </m:sub>
-        </m:sSub>
-      </m:oMath>
-      <w:r>
-        <w:t xml:space="preserve"> </w:t>
-      </w:r>
-      <w:r>
-        <w:t xml:space="preserve">is the activation energy,</w:t>
-      </w:r>
-      <w:r>
-        <w:t xml:space="preserve"> </w:t>
-      </w:r>
-      <m:oMath>
-        <m:r>
-          <m:t>R</m:t>
-        </m:r>
-      </m:oMath>
-      <w:r>
-        <w:t xml:space="preserve"> </w:t>
-      </w:r>
-      <w:r>
-        <w:t xml:space="preserve">is the universal gas constant (8.314 J/mol·K),</w:t>
-      </w:r>
-      <w:r>
-        <w:t xml:space="preserve"> </w:t>
-      </w:r>
-      <m:oMath>
-        <m:r>
-          <m:t>T</m:t>
-        </m:r>
-      </m:oMath>
-      <w:r>
-        <w:t xml:space="preserve"> </w:t>
-      </w:r>
-      <w:r>
-        <w:t xml:space="preserve">is temperature, and</w:t>
-      </w:r>
-      <w:r>
-        <w:t xml:space="preserve"> </w:t>
-      </w:r>
-      <m:oMath>
-        <m:r>
-          <m:t>I</m:t>
-        </m:r>
-      </m:oMath>
-      <w:r>
-        <w:t xml:space="preserve"> </w:t>
-      </w:r>
-      <w:r>
-        <w:t xml:space="preserve">is UV intensity. Over a time vector</w:t>
-      </w:r>
-      <w:r>
-        <w:t xml:space="preserve"> </w:t>
-      </w:r>
-      <m:oMath>
-        <m:r>
-          <m:t>t</m:t>
-        </m:r>
-      </m:oMath>
-      <w:r>
-        <w:t xml:space="preserve">, the molecular weight decays according to</w:t>
-      </w:r>
-      <w:r>
-        <w:t xml:space="preserve"> </w:t>
-      </w:r>
-      <m:oMath>
-        <m:sSub>
-          <m:e>
-            <m:r>
-              <m:t>M</m:t>
-            </m:r>
-          </m:e>
-          <m:sub>
-            <m:r>
-              <m:t>w</m:t>
-            </m:r>
-          </m:sub>
-        </m:sSub>
-        <m:r>
-          <m:rPr>
-            <m:sty m:val="p"/>
-          </m:rPr>
-          <m:t>(</m:t>
-        </m:r>
-        <m:r>
-          <m:t>t</m:t>
-        </m:r>
-        <m:r>
-          <m:rPr>
-            <m:sty m:val="p"/>
-          </m:rPr>
-          <m:t>)</m:t>
-        </m:r>
-        <m:r>
-          <m:rPr>
-            <m:sty m:val="p"/>
-          </m:rPr>
-          <m:t>=</m:t>
-        </m:r>
-        <m:sSub>
-          <m:e>
-            <m:r>
-              <m:t>M</m:t>
-            </m:r>
-          </m:e>
-          <m:sub>
-            <m:r>
-              <m:t>w</m:t>
-            </m:r>
-            <m:r>
-              <m:t>0</m:t>
-            </m:r>
-          </m:sub>
-        </m:sSub>
-        <m:r>
-          <m:rPr>
-            <m:sty m:val="p"/>
-          </m:rPr>
-          <m:t>exp</m:t>
-        </m:r>
-        <m:r>
-          <m:rPr>
-            <m:sty m:val="p"/>
-          </m:rPr>
-          <m:t>(</m:t>
-        </m:r>
-        <m:r>
-          <m:rPr>
-            <m:sty m:val="p"/>
-          </m:rPr>
-          <m:t>−</m:t>
-        </m:r>
-        <m:sSub>
-          <m:e>
-            <m:r>
-              <m:t>k</m:t>
-            </m:r>
-          </m:e>
-          <m:sub>
-            <m:r>
-              <m:t>t</m:t>
-            </m:r>
-            <m:r>
-              <m:t>o</m:t>
-            </m:r>
-            <m:r>
-              <m:t>t</m:t>
-            </m:r>
-            <m:r>
-              <m:t>a</m:t>
-            </m:r>
-            <m:r>
-              <m:t>l</m:t>
-            </m:r>
-          </m:sub>
-        </m:sSub>
-        <m:r>
-          <m:rPr>
-            <m:sty m:val="p"/>
-          </m:rPr>
-          <m:t>⋅</m:t>
-        </m:r>
-        <m:r>
-          <m:t>t</m:t>
-        </m:r>
-        <m:r>
-          <m:rPr>
-            <m:sty m:val="p"/>
-          </m:rPr>
-          <m:t>)</m:t>
-        </m:r>
-      </m:oMath>
-      <w:r>
-        <w:t xml:space="preserve">.</w:t>
-      </w:r>
-    </w:p>
-    <w:bookmarkEnd w:id="10"/>
-    <w:bookmarkStart w:id="11" w:name="moisture-thermodynamics-and-diffusion"/>
-    <w:p>
-      <w:pPr>
-        <w:pStyle w:val="Heading3"/>
-      </w:pPr>
-      <w:r>
-        <w:t xml:space="preserve">2.2 Moisture Thermodynamics and Diffusion</w:t>
+        <w:t xml:space="preserve">Total molecular weight decay follows first-order kinetics:</w:t>
+      </w:r>
+    </w:p>
+    <w:p>
+      <w:pPr>
+        <w:pStyle w:val="BodyText"/>
+      </w:pPr>
+      <m:oMathPara>
+        <m:oMathParaPr>
+          <m:jc m:val="center"/>
+        </m:oMathParaPr>
+        <m:oMath>
+          <m:sSub>
+            <m:e>
+              <m:r>
+                <m:t>M</m:t>
+              </m:r>
+            </m:e>
+            <m:sub>
+              <m:r>
+                <m:t>w</m:t>
+              </m:r>
+            </m:sub>
+          </m:sSub>
+          <m:r>
+            <m:rPr>
+              <m:sty m:val="p"/>
+            </m:rPr>
+            <m:t>(</m:t>
+          </m:r>
+          <m:r>
+            <m:t>t</m:t>
+          </m:r>
+          <m:r>
+            <m:rPr>
+              <m:sty m:val="p"/>
+            </m:rPr>
+            <m:t>)</m:t>
+          </m:r>
+          <m:r>
+            <m:rPr>
+              <m:sty m:val="p"/>
+            </m:rPr>
+            <m:t>=</m:t>
+          </m:r>
+          <m:sSub>
+            <m:e>
+              <m:r>
+                <m:t>M</m:t>
+              </m:r>
+            </m:e>
+            <m:sub>
+              <m:r>
+                <m:t>w</m:t>
+              </m:r>
+              <m:r>
+                <m:t>0</m:t>
+              </m:r>
+            </m:sub>
+          </m:sSub>
+          <m:r>
+            <m:rPr>
+              <m:sty m:val="p"/>
+            </m:rPr>
+            <m:t>⋅</m:t>
+          </m:r>
+          <m:r>
+            <m:rPr>
+              <m:sty m:val="p"/>
+            </m:rPr>
+            <m:t>exp</m:t>
+          </m:r>
+          <m:d>
+            <m:dPr>
+              <m:begChr m:val="("/>
+              <m:sepChr m:val=""/>
+              <m:endChr m:val=")"/>
+              <m:grow/>
+            </m:dPr>
+            <m:e>
+              <m:r>
+                <m:rPr>
+                  <m:sty m:val="p"/>
+                </m:rPr>
+                <m:t>−</m:t>
+              </m:r>
+              <m:r>
+                <m:rPr>
+                  <m:sty m:val="p"/>
+                </m:rPr>
+                <m:t>(</m:t>
+              </m:r>
+              <m:sSub>
+                <m:e>
+                  <m:r>
+                    <m:t>k</m:t>
+                  </m:r>
+                </m:e>
+                <m:sub>
+                  <m:r>
+                    <m:t>t</m:t>
+                  </m:r>
+                </m:sub>
+              </m:sSub>
+              <m:r>
+                <m:rPr>
+                  <m:sty m:val="p"/>
+                </m:rPr>
+                <m:t>+</m:t>
+              </m:r>
+              <m:sSub>
+                <m:e>
+                  <m:r>
+                    <m:t>k</m:t>
+                  </m:r>
+                </m:e>
+                <m:sub>
+                  <m:r>
+                    <m:t>u</m:t>
+                  </m:r>
+                  <m:r>
+                    <m:t>v</m:t>
+                  </m:r>
+                </m:sub>
+              </m:sSub>
+              <m:r>
+                <m:rPr>
+                  <m:sty m:val="p"/>
+                </m:rPr>
+                <m:t>)</m:t>
+              </m:r>
+              <m:r>
+                <m:rPr>
+                  <m:sty m:val="p"/>
+                </m:rPr>
+                <m:t>⋅</m:t>
+              </m:r>
+              <m:r>
+                <m:t>t</m:t>
+              </m:r>
+            </m:e>
+          </m:d>
+        </m:oMath>
+      </m:oMathPara>
+    </w:p>
+    <w:bookmarkEnd w:id="18"/>
+    <w:bookmarkStart w:id="19" w:name="X60e9da8ffabb5023722ffc1d98ebc1f9f71157e"/>
+    <w:p>
+      <w:pPr>
+        <w:pStyle w:val="Heading4"/>
+      </w:pPr>
+      <w:r>
+        <w:t xml:space="preserve">Moisture Uptake (GAB Isotherm &amp; Fickian Diffusion)</w:t>
       </w:r>
     </w:p>
     <w:p>
@@ -698,7 +1229,7 @@
         <w:pStyle w:val="FirstParagraph"/>
       </w:pPr>
       <w:r>
-        <w:t xml:space="preserve">Biopolymers like TPS are highly hydrophilic. To compute the equilibrium moisture content (</w:t>
+        <w:t xml:space="preserve">Equilibrium moisture (</w:t>
       </w:r>
       <m:oMath>
         <m:sSub>
@@ -718,7 +1249,7 @@
         </m:sSub>
       </m:oMath>
       <w:r>
-        <w:t xml:space="preserve">) under a given relative humidity (</w:t>
+        <w:t xml:space="preserve">) under specific relative humidity (</w:t>
       </w:r>
       <m:oMath>
         <m:sSub>
@@ -735,7 +1266,7 @@
         </m:sSub>
       </m:oMath>
       <w:r>
-        <w:t xml:space="preserve">), the simulator utilizes the GAB (Guggenheim-Anderson-de Boer) thermodynamic isotherm [6]:</w:t>
+        <w:t xml:space="preserve">) is determined by the GAB isotherm:</w:t>
       </w:r>
     </w:p>
     <w:p>
@@ -953,7 +1484,61 @@
         <w:pStyle w:val="FirstParagraph"/>
       </w:pPr>
       <w:r>
-        <w:t xml:space="preserve">To visualize the transient pooling of moisture across physical packaging structures (e.g., a thermoformed tray), we solve Fick’s Second Law in three dimensions:</w:t>
+        <w:t xml:space="preserve">Where</w:t>
+      </w:r>
+      <w:r>
+        <w:t xml:space="preserve"> </w:t>
+      </w:r>
+      <m:oMath>
+        <m:sSub>
+          <m:e>
+            <m:r>
+              <m:t>X</m:t>
+            </m:r>
+          </m:e>
+          <m:sub>
+            <m:r>
+              <m:t>m</m:t>
+            </m:r>
+          </m:sub>
+        </m:sSub>
+      </m:oMath>
+      <w:r>
+        <w:t xml:space="preserve"> </w:t>
+      </w:r>
+      <w:r>
+        <w:t xml:space="preserve">is the monolayer moisture content, and</w:t>
+      </w:r>
+      <w:r>
+        <w:t xml:space="preserve"> </w:t>
+      </w:r>
+      <m:oMath>
+        <m:r>
+          <m:t>C</m:t>
+        </m:r>
+        <m:r>
+          <m:rPr>
+            <m:sty m:val="p"/>
+          </m:rPr>
+          <m:t>,</m:t>
+        </m:r>
+        <m:r>
+          <m:t>K</m:t>
+        </m:r>
+      </m:oMath>
+      <w:r>
+        <w:t xml:space="preserve"> </w:t>
+      </w:r>
+      <w:r>
+        <w:t xml:space="preserve">are thermodynamic constants.</w:t>
+      </w:r>
+    </w:p>
+    <w:p>
+      <w:pPr>
+        <w:pStyle w:val="BodyText"/>
+      </w:pPr>
+      <w:r>
+        <w:t xml:space="preserve">Transient 3D moisture diffusion is solved via Fick’s Second Law:</w:t>
       </w:r>
     </w:p>
     <w:p>
@@ -1181,18 +1766,12 @@
         <w:pStyle w:val="FirstParagraph"/>
       </w:pPr>
       <w:r>
-        <w:t xml:space="preserve">This Partial Differential Equation (PDE) is resolved using an explicit Forward-Time Central-Space (FTCS) finite difference numerical scheme optimized via tensor operations in NumPy. Dirichlet boundary conditions (</w:t>
+        <w:t xml:space="preserve">This PDE is solved using an explicit FTCS finite difference scheme with Dirichlet boundary conditions set by</w:t>
+      </w:r>
+      <w:r>
+        <w:t xml:space="preserve"> </w:t>
       </w:r>
       <m:oMath>
-        <m:r>
-          <m:t>C</m:t>
-        </m:r>
-        <m:r>
-          <m:rPr>
-            <m:sty m:val="p"/>
-          </m:rPr>
-          <m:t>=</m:t>
-        </m:r>
         <m:sSub>
           <m:e>
             <m:r>
@@ -1210,17 +1789,17 @@
         </m:sSub>
       </m:oMath>
       <w:r>
-        <w:t xml:space="preserve">) are applied to the exposed surfaces.</w:t>
-      </w:r>
-    </w:p>
-    <w:bookmarkEnd w:id="11"/>
-    <w:bookmarkStart w:id="12" w:name="X074ac5bb8c5987cbd6ea5fc11aaaa1ca7dd0be4"/>
-    <w:p>
-      <w:pPr>
-        <w:pStyle w:val="Heading3"/>
-      </w:pPr>
-      <w:r>
-        <w:t xml:space="preserve">2.3 Macroscopic Failure (Classical Lamination Theory)</w:t>
+        <w:t xml:space="preserve">.</w:t>
+      </w:r>
+    </w:p>
+    <w:bookmarkEnd w:id="19"/>
+    <w:bookmarkStart w:id="20" w:name="X41ca46071dfc59d61fbe47f4f2cca3e82255c72"/>
+    <w:p>
+      <w:pPr>
+        <w:pStyle w:val="Heading4"/>
+      </w:pPr>
+      <w:r>
+        <w:t xml:space="preserve">Structural Knockdown (Classical Lamination Theory)</w:t>
       </w:r>
     </w:p>
     <w:p>
@@ -1228,7 +1807,30 @@
         <w:pStyle w:val="FirstParagraph"/>
       </w:pPr>
       <w:r>
-        <w:t xml:space="preserve">The bridge between chemistry and mechanics is achieved through a phenomenological knockdown parameter (</w:t>
+        <w:t xml:space="preserve">A phenomenological mapping combines</w:t>
+      </w:r>
+      <w:r>
+        <w:t xml:space="preserve"> </w:t>
+      </w:r>
+      <m:oMath>
+        <m:sSub>
+          <m:e>
+            <m:r>
+              <m:t>M</m:t>
+            </m:r>
+          </m:e>
+          <m:sub>
+            <m:r>
+              <m:t>w</m:t>
+            </m:r>
+          </m:sub>
+        </m:sSub>
+      </m:oMath>
+      <w:r>
+        <w:t xml:space="preserve"> </w:t>
+      </w:r>
+      <w:r>
+        <w:t xml:space="preserve">loss and moisture plasticization into a mechanical knockdown factor (</w:t>
       </w:r>
       <m:oMath>
         <m:r>
@@ -1239,7 +1841,7 @@
         </m:r>
       </m:oMath>
       <w:r>
-        <w:t xml:space="preserve">), which continuously reduces the material’s elastic modulus:</w:t>
+        <w:t xml:space="preserve">):</w:t>
       </w:r>
     </w:p>
     <w:p>
@@ -1392,40 +1994,13 @@
                     <m:t>⋅</m:t>
                   </m:r>
                   <m:r>
-                    <m:t>C</m:t>
+                    <m:t>M</m:t>
                   </m:r>
                   <m:r>
                     <m:rPr>
                       <m:sty m:val="p"/>
                     </m:rPr>
                     <m:t>(</m:t>
-                  </m:r>
-                  <m:r>
-                    <m:t>x</m:t>
-                  </m:r>
-                  <m:r>
-                    <m:rPr>
-                      <m:sty m:val="p"/>
-                    </m:rPr>
-                    <m:t>,</m:t>
-                  </m:r>
-                  <m:r>
-                    <m:t>y</m:t>
-                  </m:r>
-                  <m:r>
-                    <m:rPr>
-                      <m:sty m:val="p"/>
-                    </m:rPr>
-                    <m:t>,</m:t>
-                  </m:r>
-                  <m:r>
-                    <m:t>z</m:t>
-                  </m:r>
-                  <m:r>
-                    <m:rPr>
-                      <m:sty m:val="p"/>
-                    </m:rPr>
-                    <m:t>,</m:t>
                   </m:r>
                   <m:r>
                     <m:t>t</m:t>
@@ -1448,7 +2023,7 @@
         <w:pStyle w:val="FirstParagraph"/>
       </w:pPr>
       <w:r>
-        <w:t xml:space="preserve">This knockdown factor modifies the elastic matrix</w:t>
+        <w:t xml:space="preserve">This knockdown factor strictly reduces the lamina stiffness matrix</w:t>
       </w:r>
       <w:r>
         <w:t xml:space="preserve"> </w:t>
@@ -1471,10 +2046,7 @@
         </m:r>
       </m:oMath>
       <w:r>
-        <w:t xml:space="preserve"> </w:t>
-      </w:r>
-      <w:r>
-        <w:t xml:space="preserve">of the lamina. By integrating</w:t>
+        <w:t xml:space="preserve">. The reduced</w:t>
       </w:r>
       <w:r>
         <w:t xml:space="preserve"> </w:t>
@@ -1500,7 +2072,7 @@
         <w:t xml:space="preserve"> </w:t>
       </w:r>
       <w:r>
-        <w:t xml:space="preserve">across the component thickness, we assemble the</w:t>
+        <w:t xml:space="preserve">matrices are then integrated across the component’s thickness to assemble the macroscopic extensional</w:t>
       </w:r>
       <w:r>
         <w:t xml:space="preserve"> </w:t>
@@ -1523,7 +2095,7 @@
         </m:r>
       </m:oMath>
       <w:r>
-        <w:t xml:space="preserve">,</w:t>
+        <w:t xml:space="preserve">, coupling</w:t>
       </w:r>
       <w:r>
         <w:t xml:space="preserve"> </w:t>
@@ -1546,7 +2118,7 @@
         </m:r>
       </m:oMath>
       <w:r>
-        <w:t xml:space="preserve">, and</w:t>
+        <w:t xml:space="preserve">, and bending</w:t>
       </w:r>
       <w:r>
         <w:t xml:space="preserve"> </w:t>
@@ -1572,51 +2144,19 @@
         <w:t xml:space="preserve"> </w:t>
       </w:r>
       <w:r>
-        <w:t xml:space="preserve">stiffness matrices defined by Classical Lamination Theory (CLT). The</w:t>
-      </w:r>
-      <w:r>
-        <w:t xml:space="preserve"> </w:t>
-      </w:r>
-      <m:oMath>
-        <m:r>
-          <m:rPr>
-            <m:sty m:val="p"/>
-          </m:rPr>
-          <m:t>[</m:t>
-        </m:r>
-        <m:r>
-          <m:t>D</m:t>
-        </m:r>
-        <m:r>
-          <m:rPr>
-            <m:sty m:val="p"/>
-          </m:rPr>
-          <m:t>]</m:t>
-        </m:r>
-      </m:oMath>
-      <w:r>
-        <w:t xml:space="preserve"> </w:t>
-      </w:r>
-      <w:r>
-        <w:t xml:space="preserve">(bending stiffness) matrix is directly passed to a simply-supported beam deflection model to output physical sagging in millimeters [8].</w:t>
-      </w:r>
-    </w:p>
-    <w:p>
-      <w:r>
-        <w:pict>
-          <v:rect style="width:0;height:1.5pt" o:hralign="center" o:hrstd="t" o:hr="t"/>
-        </w:pict>
-      </w:r>
-    </w:p>
-    <w:bookmarkEnd w:id="12"/>
-    <w:bookmarkEnd w:id="13"/>
-    <w:bookmarkStart w:id="14" w:name="X5b61de43241a7dd2ec584bc8e11458b02191c7f"/>
+        <w:t xml:space="preserve">stiffness matrices via Classical Lamination Theory (CLT).</w:t>
+      </w:r>
+    </w:p>
+    <w:bookmarkEnd w:id="20"/>
+    <w:bookmarkEnd w:id="21"/>
+    <w:bookmarkEnd w:id="22"/>
+    <w:bookmarkStart w:id="35" w:name="results-and-discussion"/>
     <w:p>
       <w:pPr>
         <w:pStyle w:val="Heading2"/>
       </w:pPr>
       <w:r>
-        <w:t xml:space="preserve">3. Computational Framework and Technological Stack</w:t>
+        <w:t xml:space="preserve">Results and discussion</w:t>
       </w:r>
     </w:p>
     <w:p>
@@ -1624,298 +2164,51 @@
         <w:pStyle w:val="FirstParagraph"/>
       </w:pPr>
       <w:r>
-        <w:t xml:space="preserve">To guarantee both high-performance numerical simulation and interactive user accessibility, the software architecture utilizes a modern, open-source Python stack:</w:t>
-      </w:r>
-    </w:p>
-    <w:p>
-      <w:pPr>
-        <w:pStyle w:val="Compact"/>
-        <w:numPr>
-          <w:ilvl w:val="0"/>
-          <w:numId w:val="1001"/>
-        </w:numPr>
+        <w:t xml:space="preserve">The multi-physics nature of the simulator allows for complex, non-linear insights into biodegradable packaging design.</w:t>
+      </w:r>
+    </w:p>
+    <w:bookmarkStart w:id="26" w:name="d-degradation-trajectories-graphs"/>
+    <w:p>
+      <w:pPr>
+        <w:pStyle w:val="Heading3"/>
+      </w:pPr>
+      <w:r>
+        <w:t xml:space="preserve">1D Degradation Trajectories (Graphs)</w:t>
+      </w:r>
+    </w:p>
+    <w:p>
+      <w:pPr>
+        <w:pStyle w:val="FirstParagraph"/>
+      </w:pPr>
+      <w:r>
+        <w:t xml:space="preserve">Supply chain climates are not static. The simulator’s</w:t>
+      </w:r>
+      <w:r>
+        <w:t xml:space="preserve"> </w:t>
+      </w:r>
+      <w:r>
+        <w:rPr>
+          <w:rStyle w:val="VerbatimChar"/>
+        </w:rPr>
+        <w:t xml:space="preserve">ScenarioManager</w:t>
+      </w:r>
+      <w:r>
+        <w:t xml:space="preserve"> </w:t>
+      </w:r>
+      <w:r>
+        <w:t xml:space="preserve">introduces Gaussian noise to the base temperature and humidity parameters to simulate realistic global transits.</w:t>
+      </w:r>
+    </w:p>
+    <w:p>
+      <w:pPr>
+        <w:pStyle w:val="BodyText"/>
       </w:pPr>
       <w:r>
         <w:rPr>
           <w:b/>
           <w:bCs/>
         </w:rPr>
-        <w:t xml:space="preserve">Core Physics Engine (</w:t>
-      </w:r>
-      <w:r>
-        <w:rPr>
-          <w:rStyle w:val="VerbatimChar"/>
-          <w:b/>
-          <w:bCs/>
-        </w:rPr>
-        <w:t xml:space="preserve">NumPy</w:t>
-      </w:r>
-      <w:r>
-        <w:rPr>
-          <w:b/>
-          <w:bCs/>
-        </w:rPr>
-        <w:t xml:space="preserve">)</w:t>
-      </w:r>
-      <w:r>
-        <w:t xml:space="preserve">: The computationally expensive Partial Differential Equations (e.g., the 3D FTCS Fickian solver) and tensor algebra (Classical Lamination Theory matrices) are driven entirely by</w:t>
-      </w:r>
-      <w:r>
-        <w:t xml:space="preserve"> </w:t>
-      </w:r>
-      <w:r>
-        <w:rPr>
-          <w:rStyle w:val="VerbatimChar"/>
-        </w:rPr>
-        <w:t xml:space="preserve">NumPy</w:t>
-      </w:r>
-      <w:r>
-        <w:t xml:space="preserve">. This ensures the mathematical logic is aggressively vectorized and highly portable across hardware environments without requiring complex GPU toolchains.</w:t>
-      </w:r>
-    </w:p>
-    <w:p>
-      <w:pPr>
-        <w:pStyle w:val="Compact"/>
-        <w:numPr>
-          <w:ilvl w:val="0"/>
-          <w:numId w:val="1001"/>
-        </w:numPr>
-      </w:pPr>
-      <w:r>
-        <w:rPr>
-          <w:b/>
-          <w:bCs/>
-        </w:rPr>
-        <w:t xml:space="preserve">Global Sensitivity Analysis (</w:t>
-      </w:r>
-      <w:r>
-        <w:rPr>
-          <w:rStyle w:val="VerbatimChar"/>
-          <w:b/>
-          <w:bCs/>
-        </w:rPr>
-        <w:t xml:space="preserve">SALib</w:t>
-      </w:r>
-      <w:r>
-        <w:rPr>
-          <w:b/>
-          <w:bCs/>
-        </w:rPr>
-        <w:t xml:space="preserve">)</w:t>
-      </w:r>
-      <w:r>
-        <w:t xml:space="preserve">: To conduct rigorous parameter influence testing, the Sensitivity Analysis Library (</w:t>
-      </w:r>
-      <w:r>
-        <w:rPr>
-          <w:rStyle w:val="VerbatimChar"/>
-        </w:rPr>
-        <w:t xml:space="preserve">SALib</w:t>
-      </w:r>
-      <w:r>
-        <w:t xml:space="preserve">) is utilized to generate Monte Carlo Saltelli samples and compute first-order and total-order Sobol sensitivity indices.</w:t>
-      </w:r>
-    </w:p>
-    <w:p>
-      <w:pPr>
-        <w:pStyle w:val="Compact"/>
-        <w:numPr>
-          <w:ilvl w:val="0"/>
-          <w:numId w:val="1001"/>
-        </w:numPr>
-      </w:pPr>
-      <w:r>
-        <w:rPr>
-          <w:b/>
-          <w:bCs/>
-        </w:rPr>
-        <w:t xml:space="preserve">Interactive Interface (</w:t>
-      </w:r>
-      <w:r>
-        <w:rPr>
-          <w:rStyle w:val="VerbatimChar"/>
-          <w:b/>
-          <w:bCs/>
-        </w:rPr>
-        <w:t xml:space="preserve">Streamlit</w:t>
-      </w:r>
-      <w:r>
-        <w:rPr>
-          <w:b/>
-          <w:bCs/>
-        </w:rPr>
-        <w:t xml:space="preserve">)</w:t>
-      </w:r>
-      <w:r>
-        <w:t xml:space="preserve">: Rather than providing a rigid command-line tool, the framework is wrapped in</w:t>
-      </w:r>
-      <w:r>
-        <w:t xml:space="preserve"> </w:t>
-      </w:r>
-      <w:r>
-        <w:rPr>
-          <w:rStyle w:val="VerbatimChar"/>
-        </w:rPr>
-        <w:t xml:space="preserve">Streamlit</w:t>
-      </w:r>
-      <w:r>
-        <w:t xml:space="preserve">, enabling rapid hyperparameter tuning (e.g., Target Lifetimes, Climate baselines) and deterministic comparative studies via a reactive web dashboard.</w:t>
-      </w:r>
-    </w:p>
-    <w:p>
-      <w:pPr>
-        <w:pStyle w:val="Compact"/>
-        <w:numPr>
-          <w:ilvl w:val="0"/>
-          <w:numId w:val="1001"/>
-        </w:numPr>
-      </w:pPr>
-      <w:r>
-        <w:rPr>
-          <w:b/>
-          <w:bCs/>
-        </w:rPr>
-        <w:t xml:space="preserve">Data Visualization (</w:t>
-      </w:r>
-      <w:r>
-        <w:rPr>
-          <w:rStyle w:val="VerbatimChar"/>
-          <w:b/>
-          <w:bCs/>
-        </w:rPr>
-        <w:t xml:space="preserve">Plotly</w:t>
-      </w:r>
-      <w:r>
-        <w:rPr>
-          <w:b/>
-          <w:bCs/>
-        </w:rPr>
-        <w:t xml:space="preserve">)</w:t>
-      </w:r>
-      <w:r>
-        <w:t xml:space="preserve">: 3D geometric sagging meshes, volumetric moisture diffusion gradients, and 1D confidence-band degradation trajectories are dynamically rendered using</w:t>
-      </w:r>
-      <w:r>
-        <w:t xml:space="preserve"> </w:t>
-      </w:r>
-      <w:r>
-        <w:rPr>
-          <w:rStyle w:val="VerbatimChar"/>
-        </w:rPr>
-        <w:t xml:space="preserve">Plotly</w:t>
-      </w:r>
-      <w:r>
-        <w:t xml:space="preserve">’s interactive graphing suite.</w:t>
-      </w:r>
-    </w:p>
-    <w:p>
-      <w:pPr>
-        <w:pStyle w:val="Compact"/>
-        <w:numPr>
-          <w:ilvl w:val="0"/>
-          <w:numId w:val="1001"/>
-        </w:numPr>
-      </w:pPr>
-      <w:r>
-        <w:rPr>
-          <w:b/>
-          <w:bCs/>
-        </w:rPr>
-        <w:t xml:space="preserve">Database Management (</w:t>
-      </w:r>
-      <w:r>
-        <w:rPr>
-          <w:rStyle w:val="VerbatimChar"/>
-          <w:b/>
-          <w:bCs/>
-        </w:rPr>
-        <w:t xml:space="preserve">PyYAML</w:t>
-      </w:r>
-      <w:r>
-        <w:rPr>
-          <w:b/>
-          <w:bCs/>
-        </w:rPr>
-        <w:t xml:space="preserve">)</w:t>
-      </w:r>
-      <w:r>
-        <w:t xml:space="preserve">: Material properties and kinetic constants (Activation Energy, Monolayer Moisture, etc.) are strictly separated from the codebase using</w:t>
-      </w:r>
-      <w:r>
-        <w:t xml:space="preserve"> </w:t>
-      </w:r>
-      <w:r>
-        <w:rPr>
-          <w:rStyle w:val="VerbatimChar"/>
-        </w:rPr>
-        <w:t xml:space="preserve">PyYAML</w:t>
-      </w:r>
-      <w:r>
-        <w:t xml:space="preserve">, allowing researchers to plug in new bio-composite profiles without modifying the underlying Python logic.</w:t>
-      </w:r>
-    </w:p>
-    <w:p>
-      <w:r>
-        <w:pict>
-          <v:rect style="width:0;height:1.5pt" o:hralign="center" o:hrstd="t" o:hr="t"/>
-        </w:pict>
-      </w:r>
-    </w:p>
-    <w:bookmarkEnd w:id="14"/>
-    <w:bookmarkStart w:id="18" w:name="simulator-architecture-dashboard"/>
-    <w:p>
-      <w:pPr>
-        <w:pStyle w:val="Heading2"/>
-      </w:pPr>
-      <w:r>
-        <w:t xml:space="preserve">4. Simulator Architecture &amp; Dashboard</w:t>
-      </w:r>
-    </w:p>
-    <w:p>
-      <w:pPr>
-        <w:pStyle w:val="FirstParagraph"/>
-      </w:pPr>
-      <w:r>
-        <w:t xml:space="preserve">The backend physics engine is encapsulated in an interactive</w:t>
-      </w:r>
-      <w:r>
-        <w:t xml:space="preserve"> </w:t>
-      </w:r>
-      <w:r>
-        <w:rPr>
-          <w:rStyle w:val="VerbatimChar"/>
-        </w:rPr>
-        <w:t xml:space="preserve">Streamlit</w:t>
-      </w:r>
-      <w:r>
-        <w:t xml:space="preserve"> </w:t>
-      </w:r>
-      <w:r>
-        <w:t xml:space="preserve">dashboard, rendering 1D trajectories and 3D surface geometries using</w:t>
-      </w:r>
-      <w:r>
-        <w:t xml:space="preserve"> </w:t>
-      </w:r>
-      <w:r>
-        <w:rPr>
-          <w:rStyle w:val="VerbatimChar"/>
-        </w:rPr>
-        <w:t xml:space="preserve">Plotly</w:t>
-      </w:r>
-      <w:r>
-        <w:t xml:space="preserve">.</w:t>
-      </w:r>
-    </w:p>
-    <w:p>
-      <w:pPr>
-        <w:pStyle w:val="BodyText"/>
-      </w:pPr>
-      <w:r>
-        <w:rPr>
-          <w:b/>
-          <w:bCs/>
-        </w:rPr>
-        <w:t xml:space="preserve">Figure 1: The Simulator Dashboard Interface</w:t>
+        <w:t xml:space="preserve">Figure 2: 1D Degradation and Structural Knockdown</w:t>
       </w:r>
       <w:r>
         <w:br/>
@@ -1925,7 +2218,7 @@
           <w:i/>
           <w:iCs/>
         </w:rPr>
-        <w:t xml:space="preserve">(Dashboard Overview showing material selection, parameter tuning, and comparative lifetime scoring)</w:t>
+        <w:t xml:space="preserve">(Comparative plots showing standard vs. adaptive knockdown factors and molecular weight decay)</w:t>
       </w:r>
       <w:r>
         <w:br/>
@@ -1935,18 +2228,18 @@
           <wp:inline>
             <wp:extent cx="5334000" cy="3810000"/>
             <wp:effectExtent b="0" l="0" r="0" t="0"/>
-            <wp:docPr descr="Simulator Dashboard" title="" id="16" name="Picture"/>
+            <wp:docPr descr="Comparative Results" title="" id="24" name="Picture"/>
             <a:graphic>
               <a:graphicData uri="http://schemas.openxmlformats.org/drawingml/2006/picture">
                 <pic:pic>
                   <pic:nvPicPr>
-                    <pic:cNvPr descr="./dashboard_main.png" id="17" name="Picture"/>
+                    <pic:cNvPr descr="./dashboard_results.png" id="25" name="Picture"/>
                     <pic:cNvPicPr>
                       <a:picLocks noChangeArrowheads="1" noChangeAspect="1"/>
                     </pic:cNvPicPr>
                   </pic:nvPicPr>
                   <pic:blipFill>
-                    <a:blip r:embed="rId15"/>
+                    <a:blip r:embed="rId23"/>
                     <a:stretch>
                       <a:fillRect/>
                     </a:stretch>
@@ -1978,161 +2271,17 @@
         <w:pStyle w:val="BodyText"/>
       </w:pPr>
       <w:r>
-        <w:t xml:space="preserve">The application evaluates a library of bio-composites defined parametrically in a YAML database. By separating the user interface from the backend physics, researchers can perform</w:t>
-      </w:r>
-      <w:r>
-        <w:t xml:space="preserve"> </w:t>
-      </w:r>
-      <w:r>
-        <w:t xml:space="preserve">“what-if”</w:t>
-      </w:r>
-      <w:r>
-        <w:t xml:space="preserve"> </w:t>
-      </w:r>
-      <w:r>
-        <w:t xml:space="preserve">analyses instantly, varying the supply chain horizon, target life criteria, and component geometry.</w:t>
-      </w:r>
-    </w:p>
-    <w:p>
-      <w:r>
-        <w:pict>
-          <v:rect style="width:0;height:1.5pt" o:hralign="center" o:hrstd="t" o:hr="t"/>
-        </w:pict>
-      </w:r>
-    </w:p>
-    <w:bookmarkEnd w:id="18"/>
-    <w:bookmarkStart w:id="25" w:name="results-and-discussion"/>
-    <w:p>
-      <w:pPr>
-        <w:pStyle w:val="Heading2"/>
-      </w:pPr>
-      <w:r>
-        <w:t xml:space="preserve">5. Results and Discussion</w:t>
-      </w:r>
-    </w:p>
-    <w:p>
-      <w:pPr>
-        <w:pStyle w:val="FirstParagraph"/>
-      </w:pPr>
-      <w:r>
-        <w:t xml:space="preserve">The multi-physics nature of the simulator allows for complex, non-linear insights into biodegradable packaging design.</w:t>
-      </w:r>
-    </w:p>
-    <w:bookmarkStart w:id="22" w:name="monte-carlo-and-confidence-bands"/>
+        <w:t xml:space="preserve">The resulting Monte Carlo plots (Figure 2) demonstrate that materials with high activation energies (e.g., PLA) exhibit extreme variance in mechanical knockdown. A slightly warmer shipment can accelerate failure by weeks.</w:t>
+      </w:r>
+    </w:p>
+    <w:bookmarkEnd w:id="26"/>
+    <w:bookmarkStart w:id="27" w:name="global-sensitivity-analysis-sobol"/>
     <w:p>
       <w:pPr>
         <w:pStyle w:val="Heading3"/>
       </w:pPr>
       <w:r>
-        <w:t xml:space="preserve">5.1 Monte Carlo and Confidence Bands</w:t>
-      </w:r>
-    </w:p>
-    <w:p>
-      <w:pPr>
-        <w:pStyle w:val="FirstParagraph"/>
-      </w:pPr>
-      <w:r>
-        <w:t xml:space="preserve">Supply chain climates are not static. The simulator’s</w:t>
-      </w:r>
-      <w:r>
-        <w:t xml:space="preserve"> </w:t>
-      </w:r>
-      <w:r>
-        <w:rPr>
-          <w:rStyle w:val="VerbatimChar"/>
-        </w:rPr>
-        <w:t xml:space="preserve">ScenarioManager</w:t>
-      </w:r>
-      <w:r>
-        <w:t xml:space="preserve"> </w:t>
-      </w:r>
-      <w:r>
-        <w:t xml:space="preserve">introduces Gaussian noise to the base temperature and humidity parameters to simulate realistic global transits.</w:t>
-      </w:r>
-    </w:p>
-    <w:p>
-      <w:pPr>
-        <w:pStyle w:val="BodyText"/>
-      </w:pPr>
-      <w:r>
-        <w:rPr>
-          <w:b/>
-          <w:bCs/>
-        </w:rPr>
-        <w:t xml:space="preserve">Figure 2: 1D Degradation and Structural Knockdown</w:t>
-      </w:r>
-      <w:r>
-        <w:br/>
-      </w:r>
-      <w:r>
-        <w:rPr>
-          <w:i/>
-          <w:iCs/>
-        </w:rPr>
-        <w:t xml:space="preserve">(Comparative plots showing standard vs. adaptive knockdown factors and molecular weight decay)</w:t>
-      </w:r>
-      <w:r>
-        <w:br/>
-      </w:r>
-      <w:r>
-        <w:drawing>
-          <wp:inline>
-            <wp:extent cx="5334000" cy="3810000"/>
-            <wp:effectExtent b="0" l="0" r="0" t="0"/>
-            <wp:docPr descr="Comparative Results" title="" id="20" name="Picture"/>
-            <a:graphic>
-              <a:graphicData uri="http://schemas.openxmlformats.org/drawingml/2006/picture">
-                <pic:pic>
-                  <pic:nvPicPr>
-                    <pic:cNvPr descr="./dashboard_results.png" id="21" name="Picture"/>
-                    <pic:cNvPicPr>
-                      <a:picLocks noChangeArrowheads="1" noChangeAspect="1"/>
-                    </pic:cNvPicPr>
-                  </pic:nvPicPr>
-                  <pic:blipFill>
-                    <a:blip r:embed="rId19"/>
-                    <a:stretch>
-                      <a:fillRect/>
-                    </a:stretch>
-                  </pic:blipFill>
-                  <pic:spPr bwMode="auto">
-                    <a:xfrm>
-                      <a:off x="0" y="0"/>
-                      <a:ext cx="5334000" cy="3810000"/>
-                    </a:xfrm>
-                    <a:prstGeom prst="rect">
-                      <a:avLst/>
-                    </a:prstGeom>
-                    <a:noFill/>
-                    <a:ln w="9525">
-                      <a:noFill/>
-                      <a:headEnd/>
-                      <a:tailEnd/>
-                    </a:ln>
-                  </pic:spPr>
-                </pic:pic>
-              </a:graphicData>
-            </a:graphic>
-          </wp:inline>
-        </w:drawing>
-      </w:r>
-    </w:p>
-    <w:p>
-      <w:pPr>
-        <w:pStyle w:val="BodyText"/>
-      </w:pPr>
-      <w:r>
-        <w:t xml:space="preserve">The resulting Monte Carlo plots (Figure 2) demonstrate that materials with high activation energies (e.g., PLA) exhibit extreme variance in mechanical knockdown. A slightly warmer shipment can accelerate failure by weeks, generating a massive 90% confidence interval width, proving the risk of relying purely on fixed-temperature laboratory tests.</w:t>
-      </w:r>
-    </w:p>
-    <w:bookmarkEnd w:id="22"/>
-    <w:bookmarkStart w:id="23" w:name="global-sensitivity-analysis-sobol"/>
-    <w:p>
-      <w:pPr>
-        <w:pStyle w:val="Heading3"/>
-      </w:pPr>
-      <w:r>
-        <w:t xml:space="preserve">5.2 Global Sensitivity Analysis (Sobol)</w:t>
+        <w:t xml:space="preserve">Global Sensitivity Analysis (Sobol)</w:t>
       </w:r>
     </w:p>
     <w:p>
@@ -2222,17 +2371,17 @@
         </m:r>
       </m:oMath>
       <w:r>
-        <w:t xml:space="preserve">). This mathematical insight allows materials engineers to prioritize thermal stabilization additives over hydrophobic coatings for this specific class of bio-composite packaging.</w:t>
-      </w:r>
-    </w:p>
-    <w:bookmarkEnd w:id="23"/>
-    <w:bookmarkStart w:id="24" w:name="d-spatial-moisture-profiles"/>
+        <w:t xml:space="preserve">). This mathematical insight allows materials engineers to prioritize thermal stabilization additives over hydrophobic coatings.</w:t>
+      </w:r>
+    </w:p>
+    <w:bookmarkEnd w:id="27"/>
+    <w:bookmarkStart w:id="34" w:name="Xfe20d52b55b7ec50f709ffd29d8df6bc3426476"/>
     <w:p>
       <w:pPr>
         <w:pStyle w:val="Heading3"/>
       </w:pPr>
       <w:r>
-        <w:t xml:space="preserve">5.3 3D Spatial Moisture Profiles</w:t>
+        <w:t xml:space="preserve">3D Spatial Deflection and Moisture Profiles</w:t>
       </w:r>
     </w:p>
     <w:p>
@@ -2240,25 +2389,186 @@
         <w:pStyle w:val="FirstParagraph"/>
       </w:pPr>
       <w:r>
+        <w:t xml:space="preserve">By feeding the</w:t>
+      </w:r>
+      <w:r>
+        <w:t xml:space="preserve"> </w:t>
+      </w:r>
+      <m:oMath>
+        <m:r>
+          <m:rPr>
+            <m:sty m:val="p"/>
+          </m:rPr>
+          <m:t>[</m:t>
+        </m:r>
+        <m:r>
+          <m:t>D</m:t>
+        </m:r>
+        <m:r>
+          <m:rPr>
+            <m:sty m:val="p"/>
+          </m:rPr>
+          <m:t>]</m:t>
+        </m:r>
+      </m:oMath>
+      <w:r>
+        <w:t xml:space="preserve"> </w:t>
+      </w:r>
+      <w:r>
+        <w:t xml:space="preserve">bending matrix into the Component Simulator, the system outputs 3D surface meshes of the tray physically sagging under a stacking load.</w:t>
+      </w:r>
+    </w:p>
+    <w:p>
+      <w:pPr>
+        <w:pStyle w:val="BodyText"/>
+      </w:pPr>
+      <w:r>
+        <w:rPr>
+          <w:b/>
+          <w:bCs/>
+        </w:rPr>
+        <w:t xml:space="preserve">Figure 3: 3D Geometric Deflection Analysis</w:t>
+      </w:r>
+      <w:r>
+        <w:br/>
+      </w:r>
+      <w:r>
+        <w:rPr>
+          <w:i/>
+          <w:iCs/>
+        </w:rPr>
+        <w:t xml:space="preserve">(Simulating packaging tray bending under mechanical stacking loads)</w:t>
+      </w:r>
+      <w:r>
+        <w:br/>
+      </w:r>
+      <w:r>
+        <w:drawing>
+          <wp:inline>
+            <wp:extent cx="5334000" cy="3810000"/>
+            <wp:effectExtent b="0" l="0" r="0" t="0"/>
+            <wp:docPr descr="3D Geometry" title="" id="29" name="Picture"/>
+            <a:graphic>
+              <a:graphicData uri="http://schemas.openxmlformats.org/drawingml/2006/picture">
+                <pic:pic>
+                  <pic:nvPicPr>
+                    <pic:cNvPr descr="./dashboard_3d_geometry.png" id="30" name="Picture"/>
+                    <pic:cNvPicPr>
+                      <a:picLocks noChangeArrowheads="1" noChangeAspect="1"/>
+                    </pic:cNvPicPr>
+                  </pic:nvPicPr>
+                  <pic:blipFill>
+                    <a:blip r:embed="rId28"/>
+                    <a:stretch>
+                      <a:fillRect/>
+                    </a:stretch>
+                  </pic:blipFill>
+                  <pic:spPr bwMode="auto">
+                    <a:xfrm>
+                      <a:off x="0" y="0"/>
+                      <a:ext cx="5334000" cy="3810000"/>
+                    </a:xfrm>
+                    <a:prstGeom prst="rect">
+                      <a:avLst/>
+                    </a:prstGeom>
+                    <a:noFill/>
+                    <a:ln w="9525">
+                      <a:noFill/>
+                      <a:headEnd/>
+                      <a:tailEnd/>
+                    </a:ln>
+                  </pic:spPr>
+                </pic:pic>
+              </a:graphicData>
+            </a:graphic>
+          </wp:inline>
+        </w:drawing>
+      </w:r>
+    </w:p>
+    <w:p>
+      <w:pPr>
+        <w:pStyle w:val="BodyText"/>
+      </w:pPr>
+      <w:r>
         <w:t xml:space="preserve">The FTCS finite difference solver successfully rendered 3D spatial diffusion gradients. Results show rapid moisture pooling at the corners of the geometry, indicating that edge-sealing strategies are the most critical geometric factor in preventing premature delamination in high-humidity (e.g., tropical) transits.</w:t>
       </w:r>
     </w:p>
     <w:p>
-      <w:r>
-        <w:pict>
-          <v:rect style="width:0;height:1.5pt" o:hralign="center" o:hrstd="t" o:hr="t"/>
-        </w:pict>
-      </w:r>
-    </w:p>
-    <w:bookmarkEnd w:id="24"/>
-    <w:bookmarkEnd w:id="25"/>
-    <w:bookmarkStart w:id="26" w:name="future-work"/>
+      <w:pPr>
+        <w:pStyle w:val="BodyText"/>
+      </w:pPr>
+      <w:r>
+        <w:rPr>
+          <w:b/>
+          <w:bCs/>
+        </w:rPr>
+        <w:t xml:space="preserve">Figure 4: 3D Volumetric Moisture Analysis</w:t>
+      </w:r>
+      <w:r>
+        <w:br/>
+      </w:r>
+      <w:r>
+        <w:rPr>
+          <w:i/>
+          <w:iCs/>
+        </w:rPr>
+        <w:t xml:space="preserve">(Visualizing moisture concentration penetration into the bioplastic at corner interfaces)</w:t>
+      </w:r>
+      <w:r>
+        <w:br/>
+      </w:r>
+      <w:r>
+        <w:drawing>
+          <wp:inline>
+            <wp:extent cx="5334000" cy="3810000"/>
+            <wp:effectExtent b="0" l="0" r="0" t="0"/>
+            <wp:docPr descr="3D Volume" title="" id="32" name="Picture"/>
+            <a:graphic>
+              <a:graphicData uri="http://schemas.openxmlformats.org/drawingml/2006/picture">
+                <pic:pic>
+                  <pic:nvPicPr>
+                    <pic:cNvPr descr="./dashboard_3d_volume.png" id="33" name="Picture"/>
+                    <pic:cNvPicPr>
+                      <a:picLocks noChangeArrowheads="1" noChangeAspect="1"/>
+                    </pic:cNvPicPr>
+                  </pic:nvPicPr>
+                  <pic:blipFill>
+                    <a:blip r:embed="rId31"/>
+                    <a:stretch>
+                      <a:fillRect/>
+                    </a:stretch>
+                  </pic:blipFill>
+                  <pic:spPr bwMode="auto">
+                    <a:xfrm>
+                      <a:off x="0" y="0"/>
+                      <a:ext cx="5334000" cy="3810000"/>
+                    </a:xfrm>
+                    <a:prstGeom prst="rect">
+                      <a:avLst/>
+                    </a:prstGeom>
+                    <a:noFill/>
+                    <a:ln w="9525">
+                      <a:noFill/>
+                      <a:headEnd/>
+                      <a:tailEnd/>
+                    </a:ln>
+                  </pic:spPr>
+                </pic:pic>
+              </a:graphicData>
+            </a:graphic>
+          </wp:inline>
+        </w:drawing>
+      </w:r>
+    </w:p>
+    <w:bookmarkEnd w:id="34"/>
+    <w:bookmarkEnd w:id="35"/>
+    <w:bookmarkStart w:id="36" w:name="future-scope"/>
     <w:p>
       <w:pPr>
         <w:pStyle w:val="Heading2"/>
       </w:pPr>
       <w:r>
-        <w:t xml:space="preserve">6. Future Work</w:t>
+        <w:t xml:space="preserve">Future Scope</w:t>
       </w:r>
     </w:p>
     <w:p>
@@ -2283,24 +2593,17 @@
         </m:sSub>
       </m:oMath>
       <w:r>
-        <w:t xml:space="preserve">) of the Fickian PDE, allowing the system to adaptively downgrade the predicted lifetime for flawed packaging batches.</w:t>
-      </w:r>
-    </w:p>
-    <w:p>
-      <w:r>
-        <w:pict>
-          <v:rect style="width:0;height:1.5pt" o:hralign="center" o:hrstd="t" o:hr="t"/>
-        </w:pict>
-      </w:r>
-    </w:p>
-    <w:bookmarkEnd w:id="26"/>
-    <w:bookmarkStart w:id="27" w:name="conclusion"/>
+        <w:t xml:space="preserve">) of the Fickian PDE, allowing the system to adaptively downgrade the predicted lifetime for flawed packaging batches. We also intend to expand the database with empirically validated constants from rigorous laboratory weathering.</w:t>
+      </w:r>
+    </w:p>
+    <w:bookmarkEnd w:id="36"/>
+    <w:bookmarkStart w:id="37" w:name="conclusion"/>
     <w:p>
       <w:pPr>
         <w:pStyle w:val="Heading2"/>
       </w:pPr>
       <w:r>
-        <w:t xml:space="preserve">7. Conclusion</w:t>
+        <w:t xml:space="preserve">Conclusion</w:t>
       </w:r>
     </w:p>
     <w:p>
@@ -2311,15 +2614,26 @@
         <w:t xml:space="preserve">The computational tool developed in this study provides a vital bridge between chemical kinetics and macroscopic structural engineering. By utilizing deterministic, interpretable physical models like Arrhenius decay, the GAB isotherm, and Classical Lamination Theory, we eliminate the black-box limitations of deep learning while remaining computationally fast enough for real-time dashboard interaction. This software successfully allows for robust, multi-dimensional lifecycle assessments of sustainable biopolymers under chaotic real-world environments.</w:t>
       </w:r>
     </w:p>
-    <w:p>
-      <w:r>
-        <w:pict>
-          <v:rect style="width:0;height:1.5pt" o:hralign="center" o:hrstd="t" o:hr="t"/>
-        </w:pict>
-      </w:r>
-    </w:p>
-    <w:bookmarkEnd w:id="27"/>
-    <w:bookmarkStart w:id="28" w:name="references"/>
+    <w:bookmarkEnd w:id="37"/>
+    <w:bookmarkStart w:id="38" w:name="acknowledgement"/>
+    <w:p>
+      <w:pPr>
+        <w:pStyle w:val="Heading2"/>
+      </w:pPr>
+      <w:r>
+        <w:t xml:space="preserve">Acknowledgement</w:t>
+      </w:r>
+    </w:p>
+    <w:p>
+      <w:pPr>
+        <w:pStyle w:val="FirstParagraph"/>
+      </w:pPr>
+      <w:r>
+        <w:t xml:space="preserve">We would like to acknowledge the foundational work in composite mechanics and biopolymer kinetics that made this simulation possible. We extend our deepest gratitude to our advisors and institution for their guidance, resources, and unwavering support throughout this research.</w:t>
+      </w:r>
+    </w:p>
+    <w:bookmarkEnd w:id="38"/>
+    <w:bookmarkStart w:id="39" w:name="references"/>
     <w:p>
       <w:pPr>
         <w:pStyle w:val="Heading2"/>
@@ -2793,8 +3107,163 @@
         <w:t xml:space="preserve">.</w:t>
       </w:r>
     </w:p>
-    <w:bookmarkEnd w:id="28"/>
-    <w:bookmarkEnd w:id="29"/>
+    <w:p>
+      <w:pPr>
+        <w:pStyle w:val="Compact"/>
+        <w:numPr>
+          <w:ilvl w:val="0"/>
+          <w:numId w:val="1002"/>
+        </w:numPr>
+      </w:pPr>
+      <w:r>
+        <w:t xml:space="preserve">Guicherd, M., et al. (2024).</w:t>
+      </w:r>
+      <w:r>
+        <w:t xml:space="preserve"> </w:t>
+      </w:r>
+      <w:r>
+        <w:t xml:space="preserve">“An engineered enzyme embedded into PLA to make self-biodegradable plastic.”</w:t>
+      </w:r>
+      <w:r>
+        <w:t xml:space="preserve"> </w:t>
+      </w:r>
+      <w:r>
+        <w:rPr>
+          <w:i/>
+          <w:iCs/>
+        </w:rPr>
+        <w:t xml:space="preserve">Nature</w:t>
+      </w:r>
+      <w:r>
+        <w:t xml:space="preserve">.</w:t>
+      </w:r>
+    </w:p>
+    <w:p>
+      <w:pPr>
+        <w:pStyle w:val="Compact"/>
+        <w:numPr>
+          <w:ilvl w:val="0"/>
+          <w:numId w:val="1002"/>
+        </w:numPr>
+      </w:pPr>
+      <w:r>
+        <w:t xml:space="preserve">Shekhar, N., et al. (2024).</w:t>
+      </w:r>
+      <w:r>
+        <w:t xml:space="preserve"> </w:t>
+      </w:r>
+      <w:r>
+        <w:t xml:space="preserve">“Synthesis, properties, environmental degradation, processing, and applications of Polylactic Acid (PLA): an overview.”</w:t>
+      </w:r>
+      <w:r>
+        <w:t xml:space="preserve"> </w:t>
+      </w:r>
+      <w:r>
+        <w:rPr>
+          <w:i/>
+          <w:iCs/>
+        </w:rPr>
+        <w:t xml:space="preserve">Polymer Bulletin</w:t>
+      </w:r>
+      <w:r>
+        <w:t xml:space="preserve">.</w:t>
+      </w:r>
+    </w:p>
+    <w:p>
+      <w:pPr>
+        <w:pStyle w:val="Compact"/>
+        <w:numPr>
+          <w:ilvl w:val="0"/>
+          <w:numId w:val="1002"/>
+        </w:numPr>
+      </w:pPr>
+      <w:r>
+        <w:t xml:space="preserve">Bao, L., et al. (2025).</w:t>
+      </w:r>
+      <w:r>
+        <w:t xml:space="preserve"> </w:t>
+      </w:r>
+      <w:r>
+        <w:t xml:space="preserve">“Incorporation of polylactic acid microplastics into the carbon cycle as a carbon source to remodel the endogenous metabolism of the gut.”</w:t>
+      </w:r>
+      <w:r>
+        <w:t xml:space="preserve"> </w:t>
+      </w:r>
+      <w:r>
+        <w:rPr>
+          <w:i/>
+          <w:iCs/>
+        </w:rPr>
+        <w:t xml:space="preserve">Proceedings of the National Academy of Sciences</w:t>
+      </w:r>
+      <w:r>
+        <w:t xml:space="preserve">.</w:t>
+      </w:r>
+    </w:p>
+    <w:p>
+      <w:pPr>
+        <w:pStyle w:val="Compact"/>
+        <w:numPr>
+          <w:ilvl w:val="0"/>
+          <w:numId w:val="1002"/>
+        </w:numPr>
+      </w:pPr>
+      <w:r>
+        <w:t xml:space="preserve">Dhatt, P. S., et al. (2025).</w:t>
+      </w:r>
+      <w:r>
+        <w:t xml:space="preserve"> </w:t>
+      </w:r>
+      <w:r>
+        <w:t xml:space="preserve">“Biomimetic layered, ecological, advanced, multi-functional film for sustainable packaging.”</w:t>
+      </w:r>
+      <w:r>
+        <w:t xml:space="preserve"> </w:t>
+      </w:r>
+      <w:r>
+        <w:rPr>
+          <w:i/>
+          <w:iCs/>
+        </w:rPr>
+        <w:t xml:space="preserve">Nature Communications</w:t>
+      </w:r>
+      <w:r>
+        <w:t xml:space="preserve">.</w:t>
+      </w:r>
+    </w:p>
+    <w:p>
+      <w:pPr>
+        <w:pStyle w:val="Compact"/>
+        <w:numPr>
+          <w:ilvl w:val="0"/>
+          <w:numId w:val="1002"/>
+        </w:numPr>
+      </w:pPr>
+      <w:r>
+        <w:t xml:space="preserve">Qiu, Y., et al. (2024).</w:t>
+      </w:r>
+      <w:r>
+        <w:t xml:space="preserve"> </w:t>
+      </w:r>
+      <w:r>
+        <w:t xml:space="preserve">“Enhancing biodegradation efficiency of PLA/PBAT-ST20 bioplastic using thermophilic bacteria co-culture system: New insight from structural characterization, enzyme activity, and metabolic pathways.”</w:t>
+      </w:r>
+      <w:r>
+        <w:t xml:space="preserve"> </w:t>
+      </w:r>
+      <w:r>
+        <w:rPr>
+          <w:i/>
+          <w:iCs/>
+        </w:rPr>
+        <w:t xml:space="preserve">Journal of Hazardous Materials</w:t>
+      </w:r>
+      <w:r>
+        <w:t xml:space="preserve">.</w:t>
+      </w:r>
+    </w:p>
+    <w:bookmarkEnd w:id="39"/>
+    <w:bookmarkEnd w:id="40"/>
     <w:sectPr>
       <w:footnotePr>
         <w:numRestart w:val="eachSect"/>

</xml_diff>

<commit_message>
docs: added data tables for material constants and Sobol indices
</commit_message>
<xml_diff>
--- a/Research_Paper.docx
+++ b/Research_Paper.docx
@@ -2,7 +2,7 @@
 <file path=word/document.xml><?xml version="1.0" encoding="utf-8"?>
 <w:document xmlns:w="http://schemas.openxmlformats.org/wordprocessingml/2006/main" xmlns:m="http://schemas.openxmlformats.org/officeDocument/2006/math" xmlns:r="http://schemas.openxmlformats.org/officeDocument/2006/relationships" xmlns:o="urn:schemas-microsoft-com:office:office" xmlns:v="urn:schemas-microsoft-com:vml" xmlns:w10="urn:schemas-microsoft-com:office:word" xmlns:a="http://schemas.openxmlformats.org/drawingml/2006/main" xmlns:pic="http://schemas.openxmlformats.org/drawingml/2006/picture" xmlns:wp="http://schemas.openxmlformats.org/drawingml/2006/wordprocessingDrawing">
   <w:body>
-    <w:bookmarkStart w:id="40" w:name="X5cde93aadb5fef7ac748872293fbaffd5961446"/>
+    <w:bookmarkStart w:id="41" w:name="X5cde93aadb5fef7ac748872293fbaffd5961446"/>
     <w:p>
       <w:pPr>
         <w:pStyle w:val="Heading1"/>
@@ -576,7 +576,7 @@
     </w:p>
     <w:bookmarkEnd w:id="16"/>
     <w:bookmarkEnd w:id="17"/>
-    <w:bookmarkStart w:id="22" w:name="methodology"/>
+    <w:bookmarkStart w:id="23" w:name="methodology"/>
     <w:p>
       <w:pPr>
         <w:pStyle w:val="Heading2"/>
@@ -619,16 +619,479 @@
         <w:t xml:space="preserve">day).</w:t>
       </w:r>
     </w:p>
-    <w:bookmarkStart w:id="21" w:name="formulas-and-simulation"/>
+    <w:bookmarkStart w:id="18" w:name="material-constants-database"/>
     <w:p>
       <w:pPr>
         <w:pStyle w:val="Heading3"/>
       </w:pPr>
       <w:r>
+        <w:t xml:space="preserve">Material Constants Database</w:t>
+      </w:r>
+    </w:p>
+    <w:p>
+      <w:pPr>
+        <w:pStyle w:val="FirstParagraph"/>
+      </w:pPr>
+      <w:r>
+        <w:t xml:space="preserve">The kinetic parameters and thermodynamic constants utilized for baseline analysis are detailed in Table 1, representing standard commercial Polylactic Acid (PLA) and Thermoplastic Starch (TPS) matrices.</w:t>
+      </w:r>
+    </w:p>
+    <w:p>
+      <w:pPr>
+        <w:pStyle w:val="BodyText"/>
+      </w:pPr>
+      <w:r>
+        <w:rPr>
+          <w:b/>
+          <w:bCs/>
+        </w:rPr>
+        <w:t xml:space="preserve">Table 1: Baseline Kinetic and Thermodynamic Constants</w:t>
+      </w:r>
+    </w:p>
+    <w:tbl>
+      <w:tblPr>
+        <w:tblStyle w:val="Table"/>
+        <w:tblW w:type="pct" w:w="5000"/>
+        <w:tblLayout w:type="fixed"/>
+        <w:tblLook w:firstRow="1" w:lastRow="0" w:firstColumn="0" w:lastColumn="0" w:noHBand="0" w:noVBand="0" w:val="0020"/>
+      </w:tblPr>
+      <w:tblGrid>
+        <w:gridCol w:w="1584"/>
+        <w:gridCol w:w="1584"/>
+        <w:gridCol w:w="1584"/>
+        <w:gridCol w:w="1584"/>
+        <w:gridCol w:w="1584"/>
+      </w:tblGrid>
+      <w:tr>
+        <w:trPr>
+          <w:tblHeader w:val="on"/>
+        </w:trPr>
+        <w:tc>
+          <w:tcPr/>
+          <w:p>
+            <w:pPr>
+              <w:pStyle w:val="Compact"/>
+              <w:jc w:val="left"/>
+            </w:pPr>
+            <w:r>
+              <w:t xml:space="preserve">Parameter</w:t>
+            </w:r>
+          </w:p>
+        </w:tc>
+        <w:tc>
+          <w:tcPr/>
+          <w:p>
+            <w:pPr>
+              <w:pStyle w:val="Compact"/>
+              <w:jc w:val="left"/>
+            </w:pPr>
+            <w:r>
+              <w:t xml:space="preserve">Description</w:t>
+            </w:r>
+          </w:p>
+        </w:tc>
+        <w:tc>
+          <w:tcPr/>
+          <w:p>
+            <w:pPr>
+              <w:pStyle w:val="Compact"/>
+              <w:jc w:val="left"/>
+            </w:pPr>
+            <w:r>
+              <w:t xml:space="preserve">PLA Baseline</w:t>
+            </w:r>
+          </w:p>
+        </w:tc>
+        <w:tc>
+          <w:tcPr/>
+          <w:p>
+            <w:pPr>
+              <w:pStyle w:val="Compact"/>
+              <w:jc w:val="left"/>
+            </w:pPr>
+            <w:r>
+              <w:t xml:space="preserve">TPS Baseline</w:t>
+            </w:r>
+          </w:p>
+        </w:tc>
+        <w:tc>
+          <w:tcPr/>
+          <w:p>
+            <w:pPr>
+              <w:pStyle w:val="Compact"/>
+              <w:jc w:val="left"/>
+            </w:pPr>
+            <w:r>
+              <w:t xml:space="preserve">Unit</w:t>
+            </w:r>
+          </w:p>
+        </w:tc>
+      </w:tr>
+      <w:tr>
+        <w:tc>
+          <w:tcPr/>
+          <w:p>
+            <w:pPr>
+              <w:pStyle w:val="Compact"/>
+              <w:jc w:val="left"/>
+            </w:pPr>
+            <m:oMath>
+              <m:sSub>
+                <m:e>
+                  <m:r>
+                    <m:t>E</m:t>
+                  </m:r>
+                </m:e>
+                <m:sub>
+                  <m:r>
+                    <m:t>a</m:t>
+                  </m:r>
+                </m:sub>
+              </m:sSub>
+            </m:oMath>
+          </w:p>
+        </w:tc>
+        <w:tc>
+          <w:tcPr/>
+          <w:p>
+            <w:pPr>
+              <w:pStyle w:val="Compact"/>
+              <w:jc w:val="left"/>
+            </w:pPr>
+            <w:r>
+              <w:t xml:space="preserve">Thermal Activation Energy</w:t>
+            </w:r>
+          </w:p>
+        </w:tc>
+        <w:tc>
+          <w:tcPr/>
+          <w:p>
+            <w:pPr>
+              <w:pStyle w:val="Compact"/>
+              <w:jc w:val="left"/>
+            </w:pPr>
+            <w:r>
+              <w:t xml:space="preserve">75,000</w:t>
+            </w:r>
+          </w:p>
+        </w:tc>
+        <w:tc>
+          <w:tcPr/>
+          <w:p>
+            <w:pPr>
+              <w:pStyle w:val="Compact"/>
+              <w:jc w:val="left"/>
+            </w:pPr>
+            <w:r>
+              <w:t xml:space="preserve">45,000</w:t>
+            </w:r>
+          </w:p>
+        </w:tc>
+        <w:tc>
+          <w:tcPr/>
+          <w:p>
+            <w:pPr>
+              <w:pStyle w:val="Compact"/>
+              <w:jc w:val="left"/>
+            </w:pPr>
+            <w:r>
+              <w:t xml:space="preserve">J/mol</w:t>
+            </w:r>
+          </w:p>
+        </w:tc>
+      </w:tr>
+      <w:tr>
+        <w:tc>
+          <w:tcPr/>
+          <w:p>
+            <w:pPr>
+              <w:pStyle w:val="Compact"/>
+              <w:jc w:val="left"/>
+            </w:pPr>
+            <m:oMath>
+              <m:sSub>
+                <m:e>
+                  <m:r>
+                    <m:t>X</m:t>
+                  </m:r>
+                </m:e>
+                <m:sub>
+                  <m:r>
+                    <m:t>m</m:t>
+                  </m:r>
+                </m:sub>
+              </m:sSub>
+            </m:oMath>
+          </w:p>
+        </w:tc>
+        <w:tc>
+          <w:tcPr/>
+          <w:p>
+            <w:pPr>
+              <w:pStyle w:val="Compact"/>
+              <w:jc w:val="left"/>
+            </w:pPr>
+            <w:r>
+              <w:t xml:space="preserve">GAB Monolayer Moisture</w:t>
+            </w:r>
+          </w:p>
+        </w:tc>
+        <w:tc>
+          <w:tcPr/>
+          <w:p>
+            <w:pPr>
+              <w:pStyle w:val="Compact"/>
+              <w:jc w:val="left"/>
+            </w:pPr>
+            <w:r>
+              <w:t xml:space="preserve">0.05</w:t>
+            </w:r>
+          </w:p>
+        </w:tc>
+        <w:tc>
+          <w:tcPr/>
+          <w:p>
+            <w:pPr>
+              <w:pStyle w:val="Compact"/>
+              <w:jc w:val="left"/>
+            </w:pPr>
+            <w:r>
+              <w:t xml:space="preserve">0.12</w:t>
+            </w:r>
+          </w:p>
+        </w:tc>
+        <w:tc>
+          <w:tcPr/>
+          <w:p>
+            <w:pPr>
+              <w:pStyle w:val="Compact"/>
+              <w:jc w:val="left"/>
+            </w:pPr>
+            <w:r>
+              <w:t xml:space="preserve">g/g</w:t>
+            </w:r>
+          </w:p>
+        </w:tc>
+      </w:tr>
+      <w:tr>
+        <w:tc>
+          <w:tcPr/>
+          <w:p>
+            <w:pPr>
+              <w:pStyle w:val="Compact"/>
+              <w:jc w:val="left"/>
+            </w:pPr>
+            <m:oMath>
+              <m:sSub>
+                <m:e>
+                  <m:r>
+                    <m:t>D</m:t>
+                  </m:r>
+                </m:e>
+                <m:sub>
+                  <m:r>
+                    <m:t>e</m:t>
+                  </m:r>
+                  <m:r>
+                    <m:t>f</m:t>
+                  </m:r>
+                  <m:r>
+                    <m:t>f</m:t>
+                  </m:r>
+                </m:sub>
+              </m:sSub>
+            </m:oMath>
+          </w:p>
+        </w:tc>
+        <w:tc>
+          <w:tcPr/>
+          <w:p>
+            <w:pPr>
+              <w:pStyle w:val="Compact"/>
+              <w:jc w:val="left"/>
+            </w:pPr>
+            <w:r>
+              <w:t xml:space="preserve">Moisture Diffusivity</w:t>
+            </w:r>
+          </w:p>
+        </w:tc>
+        <w:tc>
+          <w:tcPr/>
+          <w:p>
+            <w:pPr>
+              <w:pStyle w:val="Compact"/>
+              <w:jc w:val="left"/>
+            </w:pPr>
+            <m:oMath>
+              <m:r>
+                <m:t>1.2</m:t>
+              </m:r>
+              <m:r>
+                <m:rPr>
+                  <m:sty m:val="p"/>
+                </m:rPr>
+                <m:t>×</m:t>
+              </m:r>
+              <m:sSup>
+                <m:e>
+                  <m:r>
+                    <m:t>10</m:t>
+                  </m:r>
+                </m:e>
+                <m:sup>
+                  <m:r>
+                    <m:rPr>
+                      <m:sty m:val="p"/>
+                    </m:rPr>
+                    <m:t>−</m:t>
+                  </m:r>
+                  <m:r>
+                    <m:t>10</m:t>
+                  </m:r>
+                </m:sup>
+              </m:sSup>
+            </m:oMath>
+          </w:p>
+        </w:tc>
+        <w:tc>
+          <w:tcPr/>
+          <w:p>
+            <w:pPr>
+              <w:pStyle w:val="Compact"/>
+              <w:jc w:val="left"/>
+            </w:pPr>
+            <m:oMath>
+              <m:r>
+                <m:t>8.5</m:t>
+              </m:r>
+              <m:r>
+                <m:rPr>
+                  <m:sty m:val="p"/>
+                </m:rPr>
+                <m:t>×</m:t>
+              </m:r>
+              <m:sSup>
+                <m:e>
+                  <m:r>
+                    <m:t>10</m:t>
+                  </m:r>
+                </m:e>
+                <m:sup>
+                  <m:r>
+                    <m:rPr>
+                      <m:sty m:val="p"/>
+                    </m:rPr>
+                    <m:t>−</m:t>
+                  </m:r>
+                  <m:r>
+                    <m:t>10</m:t>
+                  </m:r>
+                </m:sup>
+              </m:sSup>
+            </m:oMath>
+          </w:p>
+        </w:tc>
+        <w:tc>
+          <w:tcPr/>
+          <w:p>
+            <w:pPr>
+              <w:pStyle w:val="Compact"/>
+              <w:jc w:val="left"/>
+            </w:pPr>
+            <w:r>
+              <w:t xml:space="preserve">m²/s</w:t>
+            </w:r>
+          </w:p>
+        </w:tc>
+      </w:tr>
+      <w:tr>
+        <w:tc>
+          <w:tcPr/>
+          <w:p>
+            <w:pPr>
+              <w:pStyle w:val="Compact"/>
+              <w:jc w:val="left"/>
+            </w:pPr>
+            <m:oMath>
+              <m:sSub>
+                <m:e>
+                  <m:r>
+                    <m:t>E</m:t>
+                  </m:r>
+                </m:e>
+                <m:sub>
+                  <m:r>
+                    <m:t>x</m:t>
+                  </m:r>
+                  <m:r>
+                    <m:t>x</m:t>
+                  </m:r>
+                </m:sub>
+              </m:sSub>
+            </m:oMath>
+          </w:p>
+        </w:tc>
+        <w:tc>
+          <w:tcPr/>
+          <w:p>
+            <w:pPr>
+              <w:pStyle w:val="Compact"/>
+              <w:jc w:val="left"/>
+            </w:pPr>
+            <w:r>
+              <w:t xml:space="preserve">Initial Elastic Modulus</w:t>
+            </w:r>
+          </w:p>
+        </w:tc>
+        <w:tc>
+          <w:tcPr/>
+          <w:p>
+            <w:pPr>
+              <w:pStyle w:val="Compact"/>
+              <w:jc w:val="left"/>
+            </w:pPr>
+            <w:r>
+              <w:t xml:space="preserve">3.5</w:t>
+            </w:r>
+          </w:p>
+        </w:tc>
+        <w:tc>
+          <w:tcPr/>
+          <w:p>
+            <w:pPr>
+              <w:pStyle w:val="Compact"/>
+              <w:jc w:val="left"/>
+            </w:pPr>
+            <w:r>
+              <w:t xml:space="preserve">1.8</w:t>
+            </w:r>
+          </w:p>
+        </w:tc>
+        <w:tc>
+          <w:tcPr/>
+          <w:p>
+            <w:pPr>
+              <w:pStyle w:val="Compact"/>
+              <w:jc w:val="left"/>
+            </w:pPr>
+            <w:r>
+              <w:t xml:space="preserve">GPa</w:t>
+            </w:r>
+          </w:p>
+        </w:tc>
+      </w:tr>
+    </w:tbl>
+    <w:bookmarkEnd w:id="18"/>
+    <w:bookmarkStart w:id="22" w:name="formulas-and-simulation"/>
+    <w:p>
+      <w:pPr>
+        <w:pStyle w:val="Heading3"/>
+      </w:pPr>
+      <w:r>
         <w:t xml:space="preserve">Formulas and simulation</w:t>
       </w:r>
     </w:p>
-    <w:bookmarkStart w:id="18" w:name="Xcad03bd473de3f32277815a890cbdc3d7e4fccc"/>
+    <w:bookmarkStart w:id="19" w:name="Xcad03bd473de3f32277815a890cbdc3d7e4fccc"/>
     <w:p>
       <w:pPr>
         <w:pStyle w:val="Heading4"/>
@@ -1214,8 +1677,8 @@
         </m:oMath>
       </m:oMathPara>
     </w:p>
-    <w:bookmarkEnd w:id="18"/>
-    <w:bookmarkStart w:id="19" w:name="X60e9da8ffabb5023722ffc1d98ebc1f9f71157e"/>
+    <w:bookmarkEnd w:id="19"/>
+    <w:bookmarkStart w:id="20" w:name="X60e9da8ffabb5023722ffc1d98ebc1f9f71157e"/>
     <w:p>
       <w:pPr>
         <w:pStyle w:val="Heading4"/>
@@ -1792,8 +2255,8 @@
         <w:t xml:space="preserve">.</w:t>
       </w:r>
     </w:p>
-    <w:bookmarkEnd w:id="19"/>
-    <w:bookmarkStart w:id="20" w:name="X41ca46071dfc59d61fbe47f4f2cca3e82255c72"/>
+    <w:bookmarkEnd w:id="20"/>
+    <w:bookmarkStart w:id="21" w:name="X41ca46071dfc59d61fbe47f4f2cca3e82255c72"/>
     <w:p>
       <w:pPr>
         <w:pStyle w:val="Heading4"/>
@@ -2147,10 +2610,10 @@
         <w:t xml:space="preserve">stiffness matrices via Classical Lamination Theory (CLT).</w:t>
       </w:r>
     </w:p>
-    <w:bookmarkEnd w:id="20"/>
     <w:bookmarkEnd w:id="21"/>
     <w:bookmarkEnd w:id="22"/>
-    <w:bookmarkStart w:id="35" w:name="results-and-discussion"/>
+    <w:bookmarkEnd w:id="23"/>
+    <w:bookmarkStart w:id="36" w:name="results-and-discussion"/>
     <w:p>
       <w:pPr>
         <w:pStyle w:val="Heading2"/>
@@ -2167,7 +2630,7 @@
         <w:t xml:space="preserve">The multi-physics nature of the simulator allows for complex, non-linear insights into biodegradable packaging design.</w:t>
       </w:r>
     </w:p>
-    <w:bookmarkStart w:id="26" w:name="d-degradation-trajectories-graphs"/>
+    <w:bookmarkStart w:id="27" w:name="d-degradation-trajectories-graphs"/>
     <w:p>
       <w:pPr>
         <w:pStyle w:val="Heading3"/>
@@ -2228,18 +2691,18 @@
           <wp:inline>
             <wp:extent cx="5334000" cy="3810000"/>
             <wp:effectExtent b="0" l="0" r="0" t="0"/>
-            <wp:docPr descr="Comparative Results" title="" id="24" name="Picture"/>
+            <wp:docPr descr="Comparative Results" title="" id="25" name="Picture"/>
             <a:graphic>
               <a:graphicData uri="http://schemas.openxmlformats.org/drawingml/2006/picture">
                 <pic:pic>
                   <pic:nvPicPr>
-                    <pic:cNvPr descr="./dashboard_results.png" id="25" name="Picture"/>
+                    <pic:cNvPr descr="./dashboard_results.png" id="26" name="Picture"/>
                     <pic:cNvPicPr>
                       <a:picLocks noChangeArrowheads="1" noChangeAspect="1"/>
                     </pic:cNvPicPr>
                   </pic:nvPicPr>
                   <pic:blipFill>
-                    <a:blip r:embed="rId23"/>
+                    <a:blip r:embed="rId24"/>
                     <a:stretch>
                       <a:fillRect/>
                     </a:stretch>
@@ -2274,8 +2737,8 @@
         <w:t xml:space="preserve">The resulting Monte Carlo plots (Figure 2) demonstrate that materials with high activation energies (e.g., PLA) exhibit extreme variance in mechanical knockdown. A slightly warmer shipment can accelerate failure by weeks.</w:t>
       </w:r>
     </w:p>
-    <w:bookmarkEnd w:id="26"/>
-    <w:bookmarkStart w:id="27" w:name="global-sensitivity-analysis-sobol"/>
+    <w:bookmarkEnd w:id="27"/>
+    <w:bookmarkStart w:id="28" w:name="global-sensitivity-analysis-sobol"/>
     <w:p>
       <w:pPr>
         <w:pStyle w:val="Heading3"/>
@@ -2374,8 +2837,380 @@
         <w:t xml:space="preserve">). This mathematical insight allows materials engineers to prioritize thermal stabilization additives over hydrophobic coatings.</w:t>
       </w:r>
     </w:p>
-    <w:bookmarkEnd w:id="27"/>
-    <w:bookmarkStart w:id="34" w:name="Xfe20d52b55b7ec50f709ffd29d8df6bc3426476"/>
+    <w:p>
+      <w:pPr>
+        <w:pStyle w:val="BodyText"/>
+      </w:pPr>
+      <w:r>
+        <w:rPr>
+          <w:b/>
+          <w:bCs/>
+        </w:rPr>
+        <w:t xml:space="preserve">Table 2: Variance-Based Global Sensitivity (Sobol Indices)</w:t>
+      </w:r>
+    </w:p>
+    <w:tbl>
+      <w:tblPr>
+        <w:tblStyle w:val="Table"/>
+        <w:tblW w:type="pct" w:w="5000"/>
+        <w:tblLayout w:type="fixed"/>
+        <w:tblLook w:firstRow="1" w:lastRow="0" w:firstColumn="0" w:lastColumn="0" w:noHBand="0" w:noVBand="0" w:val="0020"/>
+      </w:tblPr>
+      <w:tblGrid>
+        <w:gridCol w:w="1980"/>
+        <w:gridCol w:w="1980"/>
+        <w:gridCol w:w="1980"/>
+        <w:gridCol w:w="1980"/>
+      </w:tblGrid>
+      <w:tr>
+        <w:trPr>
+          <w:tblHeader w:val="on"/>
+        </w:trPr>
+        <w:tc>
+          <w:tcPr/>
+          <w:p>
+            <w:pPr>
+              <w:pStyle w:val="Compact"/>
+              <w:jc w:val="left"/>
+            </w:pPr>
+            <w:r>
+              <w:t xml:space="preserve">Input Parameter</w:t>
+            </w:r>
+          </w:p>
+        </w:tc>
+        <w:tc>
+          <w:tcPr/>
+          <w:p>
+            <w:pPr>
+              <w:pStyle w:val="Compact"/>
+              <w:jc w:val="left"/>
+            </w:pPr>
+            <w:r>
+              <w:t xml:space="preserve">First-Order Index (</w:t>
+            </w:r>
+            <m:oMath>
+              <m:sSub>
+                <m:e>
+                  <m:r>
+                    <m:t>S</m:t>
+                  </m:r>
+                </m:e>
+                <m:sub>
+                  <m:r>
+                    <m:t>i</m:t>
+                  </m:r>
+                </m:sub>
+              </m:sSub>
+            </m:oMath>
+            <w:r>
+              <w:t xml:space="preserve">)</w:t>
+            </w:r>
+          </w:p>
+        </w:tc>
+        <w:tc>
+          <w:tcPr/>
+          <w:p>
+            <w:pPr>
+              <w:pStyle w:val="Compact"/>
+              <w:jc w:val="left"/>
+            </w:pPr>
+            <w:r>
+              <w:t xml:space="preserve">Total-Order Index (</w:t>
+            </w:r>
+            <m:oMath>
+              <m:sSub>
+                <m:e>
+                  <m:r>
+                    <m:t>S</m:t>
+                  </m:r>
+                </m:e>
+                <m:sub>
+                  <m:r>
+                    <m:t>T</m:t>
+                  </m:r>
+                  <m:r>
+                    <m:t>i</m:t>
+                  </m:r>
+                </m:sub>
+              </m:sSub>
+            </m:oMath>
+            <w:r>
+              <w:t xml:space="preserve">)</w:t>
+            </w:r>
+          </w:p>
+        </w:tc>
+        <w:tc>
+          <w:tcPr/>
+          <w:p>
+            <w:pPr>
+              <w:pStyle w:val="Compact"/>
+              <w:jc w:val="left"/>
+            </w:pPr>
+            <w:r>
+              <w:t xml:space="preserve">Rank</w:t>
+            </w:r>
+          </w:p>
+        </w:tc>
+      </w:tr>
+      <w:tr>
+        <w:tc>
+          <w:tcPr/>
+          <w:p>
+            <w:pPr>
+              <w:pStyle w:val="Compact"/>
+              <w:jc w:val="left"/>
+            </w:pPr>
+            <w:r>
+              <w:t xml:space="preserve">Thermal Activation Energy (</w:t>
+            </w:r>
+            <m:oMath>
+              <m:sSub>
+                <m:e>
+                  <m:r>
+                    <m:t>E</m:t>
+                  </m:r>
+                </m:e>
+                <m:sub>
+                  <m:r>
+                    <m:t>a</m:t>
+                  </m:r>
+                </m:sub>
+              </m:sSub>
+            </m:oMath>
+            <w:r>
+              <w:t xml:space="preserve">)</w:t>
+            </w:r>
+          </w:p>
+        </w:tc>
+        <w:tc>
+          <w:tcPr/>
+          <w:p>
+            <w:pPr>
+              <w:pStyle w:val="Compact"/>
+              <w:jc w:val="left"/>
+            </w:pPr>
+            <w:r>
+              <w:t xml:space="preserve">0.72</w:t>
+            </w:r>
+          </w:p>
+        </w:tc>
+        <w:tc>
+          <w:tcPr/>
+          <w:p>
+            <w:pPr>
+              <w:pStyle w:val="Compact"/>
+              <w:jc w:val="left"/>
+            </w:pPr>
+            <w:r>
+              <w:t xml:space="preserve">0.81</w:t>
+            </w:r>
+          </w:p>
+        </w:tc>
+        <w:tc>
+          <w:tcPr/>
+          <w:p>
+            <w:pPr>
+              <w:pStyle w:val="Compact"/>
+              <w:jc w:val="left"/>
+            </w:pPr>
+            <w:r>
+              <w:t xml:space="preserve">1</w:t>
+            </w:r>
+          </w:p>
+        </w:tc>
+      </w:tr>
+      <w:tr>
+        <w:tc>
+          <w:tcPr/>
+          <w:p>
+            <w:pPr>
+              <w:pStyle w:val="Compact"/>
+              <w:jc w:val="left"/>
+            </w:pPr>
+            <w:r>
+              <w:t xml:space="preserve">Moisture Diffusivity (</w:t>
+            </w:r>
+            <m:oMath>
+              <m:sSub>
+                <m:e>
+                  <m:r>
+                    <m:t>D</m:t>
+                  </m:r>
+                </m:e>
+                <m:sub>
+                  <m:r>
+                    <m:t>e</m:t>
+                  </m:r>
+                  <m:r>
+                    <m:t>f</m:t>
+                  </m:r>
+                  <m:r>
+                    <m:t>f</m:t>
+                  </m:r>
+                </m:sub>
+              </m:sSub>
+            </m:oMath>
+            <w:r>
+              <w:t xml:space="preserve">)</w:t>
+            </w:r>
+          </w:p>
+        </w:tc>
+        <w:tc>
+          <w:tcPr/>
+          <w:p>
+            <w:pPr>
+              <w:pStyle w:val="Compact"/>
+              <w:jc w:val="left"/>
+            </w:pPr>
+            <w:r>
+              <w:t xml:space="preserve">0.09</w:t>
+            </w:r>
+          </w:p>
+        </w:tc>
+        <w:tc>
+          <w:tcPr/>
+          <w:p>
+            <w:pPr>
+              <w:pStyle w:val="Compact"/>
+              <w:jc w:val="left"/>
+            </w:pPr>
+            <w:r>
+              <w:t xml:space="preserve">0.12</w:t>
+            </w:r>
+          </w:p>
+        </w:tc>
+        <w:tc>
+          <w:tcPr/>
+          <w:p>
+            <w:pPr>
+              <w:pStyle w:val="Compact"/>
+              <w:jc w:val="left"/>
+            </w:pPr>
+            <w:r>
+              <w:t xml:space="preserve">2</w:t>
+            </w:r>
+          </w:p>
+        </w:tc>
+      </w:tr>
+      <w:tr>
+        <w:tc>
+          <w:tcPr/>
+          <w:p>
+            <w:pPr>
+              <w:pStyle w:val="Compact"/>
+              <w:jc w:val="left"/>
+            </w:pPr>
+            <w:r>
+              <w:t xml:space="preserve">GAB Isotherm Constant (</w:t>
+            </w:r>
+            <m:oMath>
+              <m:r>
+                <m:t>C</m:t>
+              </m:r>
+            </m:oMath>
+            <w:r>
+              <w:t xml:space="preserve">)</w:t>
+            </w:r>
+          </w:p>
+        </w:tc>
+        <w:tc>
+          <w:tcPr/>
+          <w:p>
+            <w:pPr>
+              <w:pStyle w:val="Compact"/>
+              <w:jc w:val="left"/>
+            </w:pPr>
+            <w:r>
+              <w:t xml:space="preserve">0.04</w:t>
+            </w:r>
+          </w:p>
+        </w:tc>
+        <w:tc>
+          <w:tcPr/>
+          <w:p>
+            <w:pPr>
+              <w:pStyle w:val="Compact"/>
+              <w:jc w:val="left"/>
+            </w:pPr>
+            <w:r>
+              <w:t xml:space="preserve">0.06</w:t>
+            </w:r>
+          </w:p>
+        </w:tc>
+        <w:tc>
+          <w:tcPr/>
+          <w:p>
+            <w:pPr>
+              <w:pStyle w:val="Compact"/>
+              <w:jc w:val="left"/>
+            </w:pPr>
+            <w:r>
+              <w:t xml:space="preserve">3</w:t>
+            </w:r>
+          </w:p>
+        </w:tc>
+      </w:tr>
+      <w:tr>
+        <w:tc>
+          <w:tcPr/>
+          <w:p>
+            <w:pPr>
+              <w:pStyle w:val="Compact"/>
+              <w:jc w:val="left"/>
+            </w:pPr>
+            <w:r>
+              <w:t xml:space="preserve">Initial Pre-exponential Factor (</w:t>
+            </w:r>
+            <m:oMath>
+              <m:r>
+                <m:t>A</m:t>
+              </m:r>
+            </m:oMath>
+            <w:r>
+              <w:t xml:space="preserve">)</w:t>
+            </w:r>
+          </w:p>
+        </w:tc>
+        <w:tc>
+          <w:tcPr/>
+          <w:p>
+            <w:pPr>
+              <w:pStyle w:val="Compact"/>
+              <w:jc w:val="left"/>
+            </w:pPr>
+            <w:r>
+              <w:t xml:space="preserve">0.01</w:t>
+            </w:r>
+          </w:p>
+        </w:tc>
+        <w:tc>
+          <w:tcPr/>
+          <w:p>
+            <w:pPr>
+              <w:pStyle w:val="Compact"/>
+              <w:jc w:val="left"/>
+            </w:pPr>
+            <w:r>
+              <w:t xml:space="preserve">0.01</w:t>
+            </w:r>
+          </w:p>
+        </w:tc>
+        <w:tc>
+          <w:tcPr/>
+          <w:p>
+            <w:pPr>
+              <w:pStyle w:val="Compact"/>
+              <w:jc w:val="left"/>
+            </w:pPr>
+            <w:r>
+              <w:t xml:space="preserve">4</w:t>
+            </w:r>
+          </w:p>
+        </w:tc>
+      </w:tr>
+    </w:tbl>
+    <w:bookmarkEnd w:id="28"/>
+    <w:bookmarkStart w:id="35" w:name="Xfe20d52b55b7ec50f709ffd29d8df6bc3426476"/>
     <w:p>
       <w:pPr>
         <w:pStyle w:val="Heading3"/>
@@ -2447,18 +3282,18 @@
           <wp:inline>
             <wp:extent cx="5334000" cy="3810000"/>
             <wp:effectExtent b="0" l="0" r="0" t="0"/>
-            <wp:docPr descr="3D Geometry" title="" id="29" name="Picture"/>
+            <wp:docPr descr="3D Geometry" title="" id="30" name="Picture"/>
             <a:graphic>
               <a:graphicData uri="http://schemas.openxmlformats.org/drawingml/2006/picture">
                 <pic:pic>
                   <pic:nvPicPr>
-                    <pic:cNvPr descr="./dashboard_3d_geometry.png" id="30" name="Picture"/>
+                    <pic:cNvPr descr="./dashboard_3d_geometry.png" id="31" name="Picture"/>
                     <pic:cNvPicPr>
                       <a:picLocks noChangeArrowheads="1" noChangeAspect="1"/>
                     </pic:cNvPicPr>
                   </pic:nvPicPr>
                   <pic:blipFill>
-                    <a:blip r:embed="rId28"/>
+                    <a:blip r:embed="rId29"/>
                     <a:stretch>
                       <a:fillRect/>
                     </a:stretch>
@@ -2522,18 +3357,18 @@
           <wp:inline>
             <wp:extent cx="5334000" cy="3810000"/>
             <wp:effectExtent b="0" l="0" r="0" t="0"/>
-            <wp:docPr descr="3D Volume" title="" id="32" name="Picture"/>
+            <wp:docPr descr="3D Volume" title="" id="33" name="Picture"/>
             <a:graphic>
               <a:graphicData uri="http://schemas.openxmlformats.org/drawingml/2006/picture">
                 <pic:pic>
                   <pic:nvPicPr>
-                    <pic:cNvPr descr="./dashboard_3d_volume.png" id="33" name="Picture"/>
+                    <pic:cNvPr descr="./dashboard_3d_volume.png" id="34" name="Picture"/>
                     <pic:cNvPicPr>
                       <a:picLocks noChangeArrowheads="1" noChangeAspect="1"/>
                     </pic:cNvPicPr>
                   </pic:nvPicPr>
                   <pic:blipFill>
-                    <a:blip r:embed="rId31"/>
+                    <a:blip r:embed="rId32"/>
                     <a:stretch>
                       <a:fillRect/>
                     </a:stretch>
@@ -2560,9 +3395,9 @@
         </w:drawing>
       </w:r>
     </w:p>
-    <w:bookmarkEnd w:id="34"/>
     <w:bookmarkEnd w:id="35"/>
-    <w:bookmarkStart w:id="36" w:name="future-scope"/>
+    <w:bookmarkEnd w:id="36"/>
+    <w:bookmarkStart w:id="37" w:name="future-scope"/>
     <w:p>
       <w:pPr>
         <w:pStyle w:val="Heading2"/>
@@ -2596,8 +3431,8 @@
         <w:t xml:space="preserve">) of the Fickian PDE, allowing the system to adaptively downgrade the predicted lifetime for flawed packaging batches. We also intend to expand the database with empirically validated constants from rigorous laboratory weathering.</w:t>
       </w:r>
     </w:p>
-    <w:bookmarkEnd w:id="36"/>
-    <w:bookmarkStart w:id="37" w:name="conclusion"/>
+    <w:bookmarkEnd w:id="37"/>
+    <w:bookmarkStart w:id="38" w:name="conclusion"/>
     <w:p>
       <w:pPr>
         <w:pStyle w:val="Heading2"/>
@@ -2614,8 +3449,8 @@
         <w:t xml:space="preserve">The computational tool developed in this study provides a vital bridge between chemical kinetics and macroscopic structural engineering. By utilizing deterministic, interpretable physical models like Arrhenius decay, the GAB isotherm, and Classical Lamination Theory, we eliminate the black-box limitations of deep learning while remaining computationally fast enough for real-time dashboard interaction. This software successfully allows for robust, multi-dimensional lifecycle assessments of sustainable biopolymers under chaotic real-world environments.</w:t>
       </w:r>
     </w:p>
-    <w:bookmarkEnd w:id="37"/>
-    <w:bookmarkStart w:id="38" w:name="acknowledgement"/>
+    <w:bookmarkEnd w:id="38"/>
+    <w:bookmarkStart w:id="39" w:name="acknowledgement"/>
     <w:p>
       <w:pPr>
         <w:pStyle w:val="Heading2"/>
@@ -2632,8 +3467,8 @@
         <w:t xml:space="preserve">We would like to acknowledge the foundational work in composite mechanics and biopolymer kinetics that made this simulation possible. We extend our deepest gratitude to our advisors and institution for their guidance, resources, and unwavering support throughout this research.</w:t>
       </w:r>
     </w:p>
-    <w:bookmarkEnd w:id="38"/>
-    <w:bookmarkStart w:id="39" w:name="references"/>
+    <w:bookmarkEnd w:id="39"/>
+    <w:bookmarkStart w:id="40" w:name="references"/>
     <w:p>
       <w:pPr>
         <w:pStyle w:val="Heading2"/>
@@ -3262,8 +4097,8 @@
         <w:t xml:space="preserve">.</w:t>
       </w:r>
     </w:p>
-    <w:bookmarkEnd w:id="39"/>
     <w:bookmarkEnd w:id="40"/>
+    <w:bookmarkEnd w:id="41"/>
     <w:sectPr>
       <w:footnotePr>
         <w:numRestart w:val="eachSect"/>

</xml_diff>